<commit_message>
Changes to aggregate functionality
</commit_message>
<xml_diff>
--- a/Documentation/Global_Partners_Solution_Design.docx
+++ b/Documentation/Global_Partners_Solution_Design.docx
@@ -35,7 +35,7 @@
           <w:iCs/>
           <w:color w:val="555555"/>
         </w:rPr>
-        <w:t xml:space="preserve">Prepared for SME review  •  Status: In progress, extract pipeline validated  •  Stack: AWS-native pipeline (per project requirement), </w:t>
+        <w:t xml:space="preserve">Prepared for SME review  •  Status: Pipeline complete (extract, transform, aggregate, CI/CD all built and validated); orchestration and dashboards remaining  •  Stack: AWS-native pipeline (per project requirement), </w:t>
       </w:r>
       <w:proofErr w:type="spellStart"/>
       <w:r>
@@ -88,7 +88,7 @@
         <w:spacing w:after="160"/>
       </w:pPr>
       <w:r>
-        <w:t xml:space="preserve">This project builds a customer analytics platform on top of restaurant/food-ordering transaction data, supporting customer lifetime value (CLV), RFM segmentation, churn risk, sales trend, loyalty program, location performance, and discount effectiveness analysis. Per project requirements, all transformation logic must be implemented in </w:t>
+        <w:t xml:space="preserve">This project builds a customer analytics platform on top of restaurant/food-ordering transaction data, supporting customer lifetime value (CLV), RFM segmentation, churn risk, sales trend, loyalty program, location performance, and discount/pricing effectiveness analysis. Per project requirements, all transformation logic must be implemented in </w:t>
       </w:r>
       <w:proofErr w:type="spellStart"/>
       <w:r>
@@ -120,7 +120,7 @@
       </w:r>
       <w:proofErr w:type="spellEnd"/>
       <w:r>
-        <w:t xml:space="preserve"> was substituted as the AWS-native alternative (see Section 4 and Section 9 for the full reasoning and cost tradeoffs considered).</w:t>
+        <w:t xml:space="preserve"> was substituted as the AWS-native alternative (see Section 4 and Section 11 for the full reasoning and cost tradeoffs considered).</w:t>
       </w:r>
     </w:p>
     <w:p>
@@ -263,7 +263,7 @@
       </w:r>
       <w:proofErr w:type="spellEnd"/>
       <w:r>
-        <w:t>.</w:t>
+        <w:t>. Covers roughly one year; actual order data spans ~3.8 years (2020-04-21 to 2024-02-21) — see Section 8 for how this coverage gap was handled.</w:t>
       </w:r>
     </w:p>
     <w:p>
@@ -320,7 +320,7 @@
       </w:r>
       <w:proofErr w:type="spellEnd"/>
       <w:r>
-        <w:t xml:space="preserve"> Scheduler — see Section 4). CI/CD is implemented via GitHub Actions using OIDC federation, avoiding any long-lived AWS credentials stored in GitHub.</w:t>
+        <w:t xml:space="preserve"> Scheduler — see Section 4). CI/CD is implemented and fully operational via GitHub Actions using OIDC federation, avoiding any long-lived AWS credentials stored in GitHub.</w:t>
       </w:r>
     </w:p>
     <w:p>
@@ -345,6 +345,22 @@
       <w:proofErr w:type="spellEnd"/>
       <w:r>
         <w:t xml:space="preserve"> visualizes via Athena.</w:t>
+      </w:r>
+    </w:p>
+    <w:p>
+      <w:pPr>
+        <w:spacing w:after="160"/>
+      </w:pPr>
+      <w:r>
+        <w:t xml:space="preserve">Pipeline status as of this revision: extract, transform, and aggregate jobs are all built, individually validated, and deployed via automated CI/CD. Remaining work: Glue Workflow orchestration/scheduling, Glue Crawler setup, and </w:t>
+      </w:r>
+      <w:proofErr w:type="spellStart"/>
+      <w:r>
+        <w:t>QuickSight</w:t>
+      </w:r>
+      <w:proofErr w:type="spellEnd"/>
+      <w:r>
+        <w:t xml:space="preserve"> dashboard construction (see Section 14).</w:t>
       </w:r>
     </w:p>
     <w:p>
@@ -365,6 +381,7 @@
           <w:b/>
           <w:bCs/>
         </w:rPr>
+        <w:lastRenderedPageBreak/>
         <w:t>Transform engine — Glue ETL (</w:t>
       </w:r>
       <w:proofErr w:type="spellStart"/>
@@ -397,11 +414,7 @@
       </w:r>
       <w:proofErr w:type="spellEnd"/>
       <w:r>
-        <w:t xml:space="preserve"> here is not a scale-driven choice — the data volume (~400K rows total) would fit comfortably in Python Shell/pandas. It is used because the requirements document explicitly mandates it (“all logics should be done using PYSPARK”). This distinction — a technology choice that is dictated by requirements versus one </w:t>
-      </w:r>
-      <w:r>
-        <w:lastRenderedPageBreak/>
-        <w:t>that is the engineer’s own judgment call — is documented here deliberately, since it is the kind of tradeoff-awareness question that comes up in technical interviews.</w:t>
+        <w:t xml:space="preserve"> here is not a scale-driven choice — the data volume (~400K rows total) would fit comfortably in Python Shell/pandas. It is used because the requirements document explicitly mandates it (“all logics should be done using PYSPARK”). This distinction — a technology choice that is dictated by requirements versus one that is the engineer's own judgment call — is documented here deliberately, since it is the kind of tradeoff-awareness question that comes up in technical interviews.</w:t>
       </w:r>
     </w:p>
     <w:p>
@@ -421,7 +434,7 @@
         <w:spacing w:after="160"/>
       </w:pPr>
       <w:r>
-        <w:t>Not specified in the requirements document; selected because the data volume does not justify more than the minimum Glue ETL allows. At 2 workers, Glue provisions 1 driver + 1 executor — no actual cross-node parallelism is being exercised, only Spark's API running on effectively single-node compute. This was a deliberate choice, documented explicitly rather than left as an unexamined default, along with a reduced shuffle-partition count (Spark's 200-partition default is excessive for a single executor) and an explicit job timeout (30–60 minutes, rather than Glue's 2880-minute default).</w:t>
+        <w:t>Not specified in the requirements document; selected because the data volume does not justify more than the minimum Glue ETL allows. At 2 workers, Glue provisions 1 driver + 1 executor — no actual cross-node parallelism is being exercised, only Spark's API running on effectively single-node compute. This was a deliberate choice, documented explicitly rather than left as an unexamined default, along with a reduced shuffle-partition count and an explicit job timeout (30–60 minutes, rather than Glue's 2880-minute default).</w:t>
       </w:r>
     </w:p>
     <w:p>
@@ -610,7 +623,7 @@
       </w:r>
       <w:proofErr w:type="spellEnd"/>
       <w:r>
-        <w:t xml:space="preserve"> because the requirement's literal wording centers GitHub as both trigger and execution environment, and because Step 3's AWS-only clause is scoped to the pipeline architecture (ingest/transform/store), not CI/CD — the same structural pattern already established for the dashboard layer. Authentication uses GitHub's OIDC provider federating to an IAM role, avoiding stored AWS access keys in GitHub secrets.</w:t>
+        <w:t xml:space="preserve"> because the requirement's literal wording centers GitHub as both trigger and execution environment, and because Step 3's AWS-only clause is scoped to the pipeline architecture (ingest/transform/store), not CI/CD — the same structural pattern already established for the dashboard layer. Authentication uses GitHub's OIDC provider federating to an IAM role, avoiding stored AWS access keys in GitHub secrets. Fully implemented and operational — see Section 13 for the deployment troubleshooting encountered.</w:t>
       </w:r>
     </w:p>
     <w:p>
@@ -656,6 +669,49 @@
       <w:r>
         <w:t>” and filter/join in Spark after the read. At this data volume, the cost of a full pull is negligible, and this sidesteps the connector bug entirely rather than fighting it.</w:t>
       </w:r>
+    </w:p>
+    <w:p>
+      <w:pPr>
+        <w:spacing w:after="160"/>
+      </w:pPr>
+      <w:r>
+        <w:rPr>
+          <w:b/>
+          <w:bCs/>
+        </w:rPr>
+        <w:t>Failure notification (SNS + Lambda) — considered, deliberately deferred</w:t>
+      </w:r>
+    </w:p>
+    <w:p>
+      <w:pPr>
+        <w:spacing w:after="160"/>
+      </w:pPr>
+      <w:r>
+        <w:t xml:space="preserve">Glue Workflow triggers have no native ability to publish directly to SNS; a working implementation would require a small Lambda function invoked by a FAILED-watching trigger, which then calls </w:t>
+      </w:r>
+      <w:proofErr w:type="spellStart"/>
+      <w:r>
+        <w:t>sns.publish</w:t>
+      </w:r>
+      <w:proofErr w:type="spellEnd"/>
+      <w:r>
+        <w:t xml:space="preserve">() with failure details, plus an email subscription on that topic. This was scoped and designed but not built for this project: the pipeline is fully correct and functional without it, and given this is a single-operator capstone project rather than a system with dependent downstream consumers, manual monitoring is an acceptable substitute. </w:t>
+      </w:r>
+      <w:r>
+        <w:rPr>
+          <w:b/>
+          <w:bCs/>
+        </w:rPr>
+        <w:t>This is flagged explicitly as a production requirement that would be built for a real deployment</w:t>
+      </w:r>
+      <w:r>
+        <w:t xml:space="preserve"> — a scheduled pipeline with no failure alerting is a genuine anti-pattern at production scale, where nobody would otherwise learn a run failed until a stale dashboard was noticed. Documented here as a conscious scope decision, not an oversight.</w:t>
+      </w:r>
+    </w:p>
+    <w:p>
+      <w:pPr>
+        <w:spacing w:after="160"/>
+      </w:pPr>
     </w:p>
     <w:p>
       <w:pPr>
@@ -663,6 +719,7 @@
         <w:spacing w:before="280" w:after="140"/>
       </w:pPr>
       <w:r>
+        <w:lastRenderedPageBreak/>
         <w:t>5. S3 Bucket &amp; Folder Architecture</w:t>
       </w:r>
     </w:p>
@@ -724,7 +781,7 @@
       </w:r>
       <w:proofErr w:type="spellEnd"/>
       <w:r>
-        <w:t>). Written by the Glue ETL extract job.</w:t>
+        <w:t>). Written by the Glue ETL extract job (append-only, audit trail).</w:t>
       </w:r>
     </w:p>
     <w:p>
@@ -737,7 +794,7 @@
         <w:spacing w:after="100"/>
       </w:pPr>
       <w:r>
-        <w:t>processed/ — cleaned, typed, joined output. Written by the transform job (not yet built at time of writing).</w:t>
+        <w:t>processed/ — cleaned, typed, standardized-column-name output per source table (no cross-table join — see Section 8). Written by the transform job, full overwrite each run.</w:t>
       </w:r>
     </w:p>
     <w:p>
@@ -750,7 +807,63 @@
         <w:spacing w:after="100"/>
       </w:pPr>
       <w:r>
-        <w:t>marts/ — seven metric tables (CLV daily, RFM segments, churn risk, sales trends, loyalty impact, location performance, discount effectiveness). Written by the aggregate job (not yet built).</w:t>
+        <w:t>marts/ — seven metric tables (</w:t>
+      </w:r>
+      <w:proofErr w:type="spellStart"/>
+      <w:r>
+        <w:t>clv_daily</w:t>
+      </w:r>
+      <w:proofErr w:type="spellEnd"/>
+      <w:r>
+        <w:t xml:space="preserve">, </w:t>
+      </w:r>
+      <w:proofErr w:type="spellStart"/>
+      <w:r>
+        <w:t>customer_segments_rfm</w:t>
+      </w:r>
+      <w:proofErr w:type="spellEnd"/>
+      <w:r>
+        <w:t xml:space="preserve">, </w:t>
+      </w:r>
+      <w:proofErr w:type="spellStart"/>
+      <w:r>
+        <w:t>churn_risk</w:t>
+      </w:r>
+      <w:proofErr w:type="spellEnd"/>
+      <w:r>
+        <w:t xml:space="preserve">, </w:t>
+      </w:r>
+      <w:proofErr w:type="spellStart"/>
+      <w:r>
+        <w:t>sales_trends</w:t>
+      </w:r>
+      <w:proofErr w:type="spellEnd"/>
+      <w:r>
+        <w:t xml:space="preserve">, </w:t>
+      </w:r>
+      <w:proofErr w:type="spellStart"/>
+      <w:r>
+        <w:t>loyalty_impact</w:t>
+      </w:r>
+      <w:proofErr w:type="spellEnd"/>
+      <w:r>
+        <w:t xml:space="preserve">, </w:t>
+      </w:r>
+      <w:proofErr w:type="spellStart"/>
+      <w:r>
+        <w:t>location_performance</w:t>
+      </w:r>
+      <w:proofErr w:type="spellEnd"/>
+      <w:r>
+        <w:t xml:space="preserve">, </w:t>
+      </w:r>
+      <w:proofErr w:type="spellStart"/>
+      <w:r>
+        <w:t>discount_effectiveness</w:t>
+      </w:r>
+      <w:proofErr w:type="spellEnd"/>
+      <w:r>
+        <w:t>). Written by the aggregate job, full overwrite each run.</w:t>
       </w:r>
     </w:p>
     <w:p>
@@ -771,7 +884,7 @@
       </w:r>
       <w:proofErr w:type="spellEnd"/>
       <w:r>
-        <w:t xml:space="preserve"> job scripts, deployed here by GitHub Actions CD rather than left in Glue's auto-created default assets bucket.</w:t>
+        <w:t xml:space="preserve"> job scripts, deployed here automatically by GitHub Actions CD.</w:t>
       </w:r>
     </w:p>
     <w:p>
@@ -798,48 +911,201 @@
         <w:spacing w:before="280" w:after="140"/>
       </w:pPr>
       <w:r>
+        <w:t>6. VPC Networking &amp; Connectivity</w:t>
+      </w:r>
+    </w:p>
+    <w:p>
+      <w:pPr>
+        <w:spacing w:after="160"/>
+      </w:pPr>
+      <w:r>
+        <w:t>Connecting a VPC-attached Glue ETL job to RDS and to supporting AWS services required considerably more infrastructure than a typical “AWS-to-AWS” connection would suggest, and surfaced through a genuine multi-stage troubleshooting process. This section documents the resulting architecture and the governing fact behind it.</w:t>
+      </w:r>
+    </w:p>
+    <w:p>
+      <w:pPr>
+        <w:spacing w:after="160"/>
+      </w:pPr>
+      <w:r>
+        <w:rPr>
+          <w:b/>
+          <w:bCs/>
+        </w:rPr>
+        <w:t>Governing fact: Glue's elastic network interfaces (ENIs) are private-IP-only by design</w:t>
+      </w:r>
+    </w:p>
+    <w:p>
+      <w:pPr>
+        <w:spacing w:after="160"/>
+      </w:pPr>
+      <w:r>
+        <w:t>Per AWS's own Glue documentation: “Each elastic network interface is assigned a private IP address from the IP address range within the subnet you specified. No public IP addresses are assigned.” This holds regardless of the subnet's own public-IP/Internet-Gateway configuration. Consequently, every AWS service the Glue job needs to reach outside RDS itself requires an explicit private network path (a VPC endpoint), even though the subnet is otherwise correctly configured as “public.”</w:t>
+      </w:r>
+    </w:p>
+    <w:p>
+      <w:pPr>
+        <w:spacing w:after="160"/>
+      </w:pPr>
+      <w:r>
+        <w:rPr>
+          <w:b/>
+          <w:bCs/>
+        </w:rPr>
+        <w:t>Issue 1: Missing IAM permission (ec2:DescribeVpcs)</w:t>
+      </w:r>
+    </w:p>
+    <w:p>
+      <w:pPr>
+        <w:spacing w:after="160"/>
+      </w:pPr>
+      <w:r>
+        <w:t xml:space="preserve">Symptom: “Unable to access VPC provided in the connection, Please check the permissions on the IAM role.” Root cause: the AWS-managed policy </w:t>
+      </w:r>
+      <w:proofErr w:type="spellStart"/>
+      <w:r>
+        <w:t>AWSGlueServiceRole</w:t>
+      </w:r>
+      <w:proofErr w:type="spellEnd"/>
+      <w:r>
+        <w:t xml:space="preserve"> — the standard baseline for Glue jobs needing VPC access — does not include ec2:DescribeVpcs, despite AWS's own Glue VPC-connection documentation listing it as required. Confirmed directly via the IAM console (action shown as “No access” under the attached policy). Fixed via a small inline policy granting this one action, matching AWS's own sample policy for this exact scenario — a genuine gap in AWS's managed policy, not a misconfiguration.</w:t>
+      </w:r>
+    </w:p>
+    <w:p>
+      <w:pPr>
+        <w:spacing w:after="160"/>
+      </w:pPr>
+      <w:r>
+        <w:rPr>
+          <w:b/>
+          <w:bCs/>
+        </w:rPr>
+        <w:t>Issues 2 &amp; 3: Glue's ENIs cannot reach STS or Secrets Manager</w:t>
+      </w:r>
+    </w:p>
+    <w:p>
+      <w:pPr>
+        <w:spacing w:after="160"/>
+      </w:pPr>
+      <w:r>
+        <w:t>Symptoms: “Failed to assume the customers role. Verify that your VPC has access to STS,” followed by an equivalent error for Secrets Manager. Both stem directly from the private-IP-only ENI behavior above — the extract job needs STS to assume its IAM role and Secrets Manager to retrieve RDS credentials, and neither is reachable without a private path. Fixed via VPC interface endpoints for both services (com.amazonaws.us-east-1.sts, com.amazonaws.us-east-1.secretsmanager).</w:t>
+      </w:r>
+    </w:p>
+    <w:p>
+      <w:pPr>
+        <w:spacing w:after="160"/>
+      </w:pPr>
+      <w:r>
+        <w:rPr>
+          <w:b/>
+          <w:bCs/>
+        </w:rPr>
+        <w:t>Proactive additions: S3 and CloudWatch Logs endpoints</w:t>
+      </w:r>
+    </w:p>
+    <w:p>
+      <w:pPr>
+        <w:spacing w:after="160"/>
+      </w:pPr>
+      <w:r>
+        <w:t>Once the private-connectivity pattern was understood, S3 (gateway endpoint, free — required for the extract job to write output) and CloudWatch Logs (interface endpoint — required for job logging) were provisioned proactively rather than discovered through a third and fourth sequential failure.</w:t>
+      </w:r>
+    </w:p>
+    <w:p>
+      <w:pPr>
+        <w:spacing w:after="160"/>
+      </w:pPr>
+      <w:r>
+        <w:rPr>
+          <w:b/>
+          <w:bCs/>
+        </w:rPr>
+        <w:t>Issue 4: Security group did not allow Spark's driver/executor traffic pattern</w:t>
+      </w:r>
+    </w:p>
+    <w:p>
+      <w:pPr>
+        <w:spacing w:after="160"/>
+      </w:pPr>
+      <w:r>
+        <w:t>Symptom: “Failed to initialize pool: ... Connect timed out,” occurring after all four VPC endpoints were confirmed Available and RDS reachability was independently confirmed via SSMS — ruling out RDS configuration, subnet placement, Network ACLs, and DB status. Root cause, per AWS's Glue troubleshooting documentation: “Apache Spark requires bidirectional connectivity among driver and executor nodes. One of the security groups needs to allow ingress rules on all TCP ports.” The security group's self-referencing rules up to this point were scoped narrowly (port 1433 for RDS, port 443 for the interface endpoints) — sufficient for reaching specific services, but not for Spark's own internal driver-to-executor coordination traffic, which uses arbitrary ports. Fixed via a self-referencing inbound rule for ALL TCP (0–65535). This was the final blocker; the connection succeeded immediately after this fix.</w:t>
+      </w:r>
+    </w:p>
+    <w:p>
+      <w:pPr>
+        <w:spacing w:after="160"/>
+      </w:pPr>
+      <w:r>
+        <w:rPr>
+          <w:b/>
+          <w:bCs/>
+        </w:rPr>
         <w:lastRenderedPageBreak/>
-        <w:t>6. VPC Networking &amp; Connectivity</w:t>
-      </w:r>
-    </w:p>
-    <w:p>
-      <w:pPr>
-        <w:spacing w:after="160"/>
-      </w:pPr>
-      <w:r>
-        <w:t>This section documents a significant, non-obvious body of troubleshooting work, since connecting a VPC-attached Glue ETL job to RDS and to supporting AWS services required considerably more infrastructure than a typical “AWS-to-AWS” connection would suggest. Full incident-level detail is preserved separately in glue_rds_connection_troubleshooting_writeup.md; this section summarizes the resulting architecture and the key governing fact behind it.</w:t>
-      </w:r>
-    </w:p>
-    <w:p>
-      <w:pPr>
-        <w:spacing w:after="160"/>
-      </w:pPr>
-      <w:r>
-        <w:rPr>
-          <w:b/>
-          <w:bCs/>
-        </w:rPr>
-        <w:t>Governing fact: Glue's elastic network interfaces (ENIs) are private-IP-only by design</w:t>
-      </w:r>
-    </w:p>
-    <w:p>
-      <w:pPr>
-        <w:spacing w:after="160"/>
-      </w:pPr>
-      <w:r>
-        <w:t>Per AWS's own Glue documentation: “Each elastic network interface is assigned a private IP address from the IP address range within the subnet you specified. No public IP addresses are assigned.” This holds regardless of the subnet's own public-IP/Internet-Gateway configuration. Consequently, every AWS service the Glue job needs to reach outside RDS itself requires an explicit private network path (a VPC endpoint), even though the subnet is otherwise correctly configured as “public.”</w:t>
-      </w:r>
-    </w:p>
-    <w:p>
-      <w:pPr>
-        <w:spacing w:after="160"/>
-      </w:pPr>
-      <w:r>
-        <w:rPr>
-          <w:b/>
-          <w:bCs/>
-        </w:rPr>
-        <w:t>VPC endpoints provisioned</w:t>
+        <w:t>A fifth endpoint, found later during actual job execution: SSM</w:t>
+      </w:r>
+    </w:p>
+    <w:p>
+      <w:pPr>
+        <w:spacing w:after="160"/>
+      </w:pPr>
+      <w:r>
+        <w:t>Symptom: the extract job's checkpoint read (a plain boto3 call to SSM Parameter Store, not routed through the Glue Connection) timed out once the Glue Connection was correctly attached to the job — attaching the connection routed the entire job's networking into the VPC, including the driver-level boto3 calls that had previously had default internet access before the connection was attached. Fixed via a fifth VPC interface endpoint (com.amazonaws.us-east-1.ssm).</w:t>
+      </w:r>
+    </w:p>
+    <w:p>
+      <w:pPr>
+        <w:spacing w:after="160"/>
+      </w:pPr>
+      <w:r>
+        <w:rPr>
+          <w:b/>
+          <w:bCs/>
+        </w:rPr>
+        <w:t>Alternative considered and rejected: NAT Gateway</w:t>
+      </w:r>
+    </w:p>
+    <w:p>
+      <w:pPr>
+        <w:spacing w:after="160"/>
+      </w:pPr>
+      <w:r>
+        <w:t>A single NAT Gateway (~$32/month plus data processing) was evaluated as a simpler alternative to provisioning one VPC endpoint per AWS service. Rejected in favor of continuing with the endpoint-per-service approach (~$22– 29/month for the interface endpoints combined, S3 gateway endpoint free) given this project's small scale and the fact that the full endpoint list, once identified, resolved the issue without further surprises.</w:t>
+      </w:r>
+    </w:p>
+    <w:p>
+      <w:pPr>
+        <w:spacing w:after="160"/>
+      </w:pPr>
+      <w:r>
+        <w:rPr>
+          <w:b/>
+          <w:bCs/>
+        </w:rPr>
+        <w:t>Net assessment</w:t>
+      </w:r>
+    </w:p>
+    <w:p>
+      <w:pPr>
+        <w:spacing w:after="160"/>
+      </w:pPr>
+      <w:r>
+        <w:t>All fixes applied were genuine, necessary corrections to real gaps — not speculative or wasted work. The inefficiency in the process was sequencing (discovering each dependency by hitting it) rather than substance; nothing built along the way needed to be undone. Full incident-level detail preserved separately in glue_rds_connection_troubleshooting_writeup.md.</w:t>
+      </w:r>
+    </w:p>
+    <w:p>
+      <w:pPr>
+        <w:pStyle w:val="Heading1"/>
+        <w:spacing w:before="280" w:after="140"/>
+      </w:pPr>
+      <w:r>
+        <w:t>7. IAM Roles &amp; Policies</w:t>
+      </w:r>
+    </w:p>
+    <w:p>
+      <w:pPr>
+        <w:spacing w:after="160"/>
+      </w:pPr>
+      <w:r>
+        <w:t>Following the same least-privilege, new-roles-per-project discipline established on Healthcare Metrics (existing roles were not reused or widened to cover this project, even where permission shapes were similar) — four Glue service roles plus one CI/CD federation role:</w:t>
       </w:r>
     </w:p>
     <w:p>
@@ -851,8 +1117,21 @@
         </w:numPr>
         <w:spacing w:after="100"/>
       </w:pPr>
-      <w:r>
-        <w:t>STS (interface) — required for the job to assume its IAM role.</w:t>
+      <w:proofErr w:type="spellStart"/>
+      <w:r>
+        <w:t>dea</w:t>
+      </w:r>
+      <w:proofErr w:type="spellEnd"/>
+      <w:r>
+        <w:t xml:space="preserve">-global-partners-glue-extract-role — RDS → S3 raw/. The only Glue role needing VPC networking permissions (via </w:t>
+      </w:r>
+      <w:proofErr w:type="spellStart"/>
+      <w:r>
+        <w:t>AWSGlueServiceRole</w:t>
+      </w:r>
+      <w:proofErr w:type="spellEnd"/>
+      <w:r>
+        <w:t xml:space="preserve"> plus the ec2:DescribeVpcs inline policy) and Secrets Manager access.</w:t>
       </w:r>
     </w:p>
     <w:p>
@@ -864,8 +1143,13 @@
         </w:numPr>
         <w:spacing w:after="100"/>
       </w:pPr>
-      <w:r>
-        <w:t>Secrets Manager (interface) — required to retrieve RDS credentials referenced by the Glue Connection.</w:t>
+      <w:proofErr w:type="spellStart"/>
+      <w:r>
+        <w:t>dea</w:t>
+      </w:r>
+      <w:proofErr w:type="spellEnd"/>
+      <w:r>
+        <w:t>-global-partners-glue-transform-role — S3 raw/ → processed/. No VPC/Secrets Manager access needed; includes s3:DeleteObject on processed/* since the transform job uses overwrite-mode writes.</w:t>
       </w:r>
     </w:p>
     <w:p>
@@ -877,8 +1161,21 @@
         </w:numPr>
         <w:spacing w:after="100"/>
       </w:pPr>
-      <w:r>
-        <w:t>SSM (interface) — required for the checkpoint read/write (boto3 calls, not covered by the Glue Connection's own VPC routing).</w:t>
+      <w:proofErr w:type="spellStart"/>
+      <w:r>
+        <w:t>dea</w:t>
+      </w:r>
+      <w:proofErr w:type="spellEnd"/>
+      <w:r>
+        <w:t xml:space="preserve">-global-partners-glue-aggregate-role — S3 processed/ → marts/. Same overwrite-mode </w:t>
+      </w:r>
+      <w:proofErr w:type="spellStart"/>
+      <w:r>
+        <w:t>DeleteObject</w:t>
+      </w:r>
+      <w:proofErr w:type="spellEnd"/>
+      <w:r>
+        <w:t xml:space="preserve"> requirement on marts/*.</w:t>
       </w:r>
     </w:p>
     <w:p>
@@ -890,8 +1187,13 @@
         </w:numPr>
         <w:spacing w:after="100"/>
       </w:pPr>
-      <w:r>
-        <w:t>CloudWatch Logs (interface) — required for job logging.</w:t>
+      <w:proofErr w:type="spellStart"/>
+      <w:r>
+        <w:t>dea</w:t>
+      </w:r>
+      <w:proofErr w:type="spellEnd"/>
+      <w:r>
+        <w:t>-global-partners-glue-crawler-role — read across all three S3 layers, write to Glue Data Catalog.</w:t>
       </w:r>
     </w:p>
     <w:p>
@@ -903,108 +1205,61 @@
         </w:numPr>
         <w:spacing w:after="100"/>
       </w:pPr>
-      <w:r>
-        <w:t>S3 (gateway, free) — required to write extract output; gateway endpoints attach via a route table entry rather than an ENI and carry no hourly cost, unlike the four interface endpoints above.</w:t>
-      </w:r>
-    </w:p>
-    <w:p>
-      <w:pPr>
-        <w:spacing w:after="160"/>
-      </w:pPr>
-      <w:r>
-        <w:rPr>
-          <w:b/>
-          <w:bCs/>
-        </w:rPr>
-        <w:t>Security group — global-partners-</w:t>
-      </w:r>
-      <w:proofErr w:type="spellStart"/>
-      <w:r>
-        <w:rPr>
-          <w:b/>
-          <w:bCs/>
-        </w:rPr>
-        <w:t>sql</w:t>
-      </w:r>
-      <w:proofErr w:type="spellEnd"/>
-      <w:r>
-        <w:rPr>
-          <w:b/>
-          <w:bCs/>
-        </w:rPr>
-        <w:t>-sg</w:t>
-      </w:r>
-    </w:p>
-    <w:p>
-      <w:pPr>
-        <w:spacing w:after="160"/>
-      </w:pPr>
-      <w:r>
-        <w:t>Three inbound rules were ultimately required: MSSQL/1433 from the developer's IP (SSMS access), MSSQL/1433 self-referencing (Glue-to-RDS), and — the rule that resolved the final, hardest-to-diagnose connection failure — ALL TCP self-referencing. Per AWS's Glue troubleshooting documentation: “Apache Spark requires bidirectional connectivity among driver and executor nodes. One of the security groups needs to allow ingress rules on all TCP ports.” The narrower, service-specific self-referencing rules (1433, 443) were necessary but not sufficient; Spark's own internal driver/executor coordination traffic required the broader rule.</w:t>
-      </w:r>
-    </w:p>
-    <w:p>
-      <w:pPr>
-        <w:spacing w:after="160"/>
-      </w:pPr>
-      <w:r>
-        <w:rPr>
-          <w:b/>
-          <w:bCs/>
-        </w:rPr>
-        <w:t xml:space="preserve">IAM gap identified: </w:t>
-      </w:r>
-      <w:proofErr w:type="spellStart"/>
-      <w:r>
-        <w:rPr>
-          <w:b/>
-          <w:bCs/>
-        </w:rPr>
-        <w:t>AWSGlueServiceRole</w:t>
-      </w:r>
-      <w:proofErr w:type="spellEnd"/>
-      <w:r>
-        <w:rPr>
-          <w:b/>
-          <w:bCs/>
-        </w:rPr>
-        <w:t xml:space="preserve"> is missing ec2:DescribeVpcs</w:t>
-      </w:r>
-    </w:p>
-    <w:p>
-      <w:pPr>
-        <w:spacing w:after="160"/>
-      </w:pPr>
-      <w:r>
-        <w:t xml:space="preserve">The AWS-managed policy </w:t>
-      </w:r>
-      <w:proofErr w:type="spellStart"/>
-      <w:r>
-        <w:t>AWSGlueServiceRole</w:t>
-      </w:r>
-      <w:proofErr w:type="spellEnd"/>
-      <w:r>
-        <w:t>, the standard baseline for Glue jobs needing VPC access, does not include ec2:DescribeVpcs, despite AWS's own Glue VPC-connection documentation listing it as required. Confirmed directly via the IAM console (action shown as “No access” under the attached policy). Resolved via a small inline policy on the extract role granting this one action, following AWS's own sample policy for this exact scenario. This was a genuine gap in AWS's own managed policy, not a misconfiguration.</w:t>
-      </w:r>
-    </w:p>
-    <w:p>
-      <w:pPr>
-        <w:spacing w:after="160"/>
-      </w:pPr>
-      <w:r>
-        <w:rPr>
-          <w:b/>
-          <w:bCs/>
-        </w:rPr>
-        <w:t>Considered and rejected: NAT Gateway</w:t>
-      </w:r>
-    </w:p>
-    <w:p>
-      <w:pPr>
-        <w:spacing w:after="160"/>
-      </w:pPr>
-      <w:r>
-        <w:t>A single NAT Gateway (≈$32/month plus data processing) was evaluated as a simpler alternative to provisioning one VPC endpoint per AWS service, since it removes the need to know the complete service dependency list upfront. Rejected in favor of continuing with the endpoint-per-service approach (≈$22/month for the three interface endpoints, S3 gateway endpoint free) given this project's small scale and the fact that the full endpoint list, once identified, resolved the issue without further surprises. Documented here as a deliberate cost/risk tradeoff, revisit if this pattern needs to scale to additional data sources.</w:t>
+      <w:proofErr w:type="spellStart"/>
+      <w:r>
+        <w:t>dea</w:t>
+      </w:r>
+      <w:proofErr w:type="spellEnd"/>
+      <w:r>
+        <w:t>-global-partners-</w:t>
+      </w:r>
+      <w:proofErr w:type="spellStart"/>
+      <w:r>
+        <w:t>github</w:t>
+      </w:r>
+      <w:proofErr w:type="spellEnd"/>
+      <w:r>
+        <w:t>-actions-role — federated via GitHub's OIDC provider, scoped to this repository/branch via a trust-policy sub condition. No long-lived AWS credentials stored in GitHub. See Section 13 for a significant trust-policy issue encountered and resolved after initial setup.</w:t>
+      </w:r>
+    </w:p>
+    <w:p>
+      <w:pPr>
+        <w:spacing w:after="160"/>
+      </w:pPr>
+      <w:r>
+        <w:t>A permissions gap was found and fixed during initial job testing, and then proactively applied to the remaining roles before they were needed: Glue itself requires s3:GetObject on the script file (under scripts/*) as a bootstrap step, before the job's own code ever runs — distinct from what the job's runtime logic needs, and not accounted for in the original least-privilege scoping (which only granted access to each job's specific data-layer prefixes). Fixed on all three Glue execution roles.</w:t>
+      </w:r>
+    </w:p>
+    <w:p>
+      <w:pPr>
+        <w:spacing w:after="160"/>
+      </w:pPr>
+      <w:r>
+        <w:t xml:space="preserve">A second gap was found during CI/CD setup: the GitHub Actions role's </w:t>
+      </w:r>
+      <w:proofErr w:type="spellStart"/>
+      <w:r>
+        <w:t>UpdateGlueJobs</w:t>
+      </w:r>
+      <w:proofErr w:type="spellEnd"/>
+      <w:r>
+        <w:t xml:space="preserve"> permission alone was insufficient to update a Glue job's script location, because doing so requires the caller to also hold </w:t>
+      </w:r>
+      <w:proofErr w:type="spellStart"/>
+      <w:r>
+        <w:t>iam:PassRole</w:t>
+      </w:r>
+      <w:proofErr w:type="spellEnd"/>
+      <w:r>
+        <w:t xml:space="preserve"> on the specific execution role being associated with the job — a standard AWS pattern whenever one IAM identity hands another role to a service on its behalf, but easy to miss until encountered directly. Fixed by scoping </w:t>
+      </w:r>
+      <w:proofErr w:type="spellStart"/>
+      <w:r>
+        <w:t>iam:PassRole</w:t>
+      </w:r>
+      <w:proofErr w:type="spellEnd"/>
+      <w:r>
+        <w:t xml:space="preserve"> on the CI/CD role to exactly the three Glue execution role ARNs it needs to pass, not a wildcard.</w:t>
       </w:r>
     </w:p>
     <w:p>
@@ -1013,15 +1268,1064 @@
         <w:spacing w:before="280" w:after="140"/>
       </w:pPr>
       <w:r>
-        <w:t>7. IAM Roles &amp; Policies</w:t>
-      </w:r>
-    </w:p>
-    <w:p>
-      <w:pPr>
-        <w:spacing w:after="160"/>
-      </w:pPr>
-      <w:r>
-        <w:t>Following the same least-privilege, new-roles-per-project discipline established on Healthcare Metrics (existing roles were not reused or widened to cover this project, even where permission shapes were similar) — four Glue service roles plus one CI/CD federation role:</w:t>
+        <w:t>8. ETL / Data Processing Plan</w:t>
+      </w:r>
+    </w:p>
+    <w:p>
+      <w:pPr>
+        <w:spacing w:after="160"/>
+      </w:pPr>
+      <w:r>
+        <w:rPr>
+          <w:b/>
+          <w:bCs/>
+        </w:rPr>
+        <w:t xml:space="preserve">Extract (Glue ETL, </w:t>
+      </w:r>
+      <w:proofErr w:type="spellStart"/>
+      <w:r>
+        <w:rPr>
+          <w:b/>
+          <w:bCs/>
+        </w:rPr>
+        <w:t>PySpark</w:t>
+      </w:r>
+      <w:proofErr w:type="spellEnd"/>
+      <w:r>
+        <w:rPr>
+          <w:b/>
+          <w:bCs/>
+        </w:rPr>
+        <w:t>) — built, deployed, and verified</w:t>
+      </w:r>
+    </w:p>
+    <w:p>
+      <w:pPr>
+        <w:spacing w:after="160"/>
+      </w:pPr>
+      <w:r>
+        <w:t xml:space="preserve">Reads a checkpoint (last-extracted CREATION_TIME_UTC) from SSM Parameter Store, defaulting to 1900-01-01 if the parameter does not yet exist. Pulls </w:t>
+      </w:r>
+      <w:proofErr w:type="spellStart"/>
+      <w:r>
+        <w:t>order_items</w:t>
+      </w:r>
+      <w:proofErr w:type="spellEnd"/>
+      <w:r>
+        <w:t xml:space="preserve"> and </w:t>
+      </w:r>
+      <w:proofErr w:type="spellStart"/>
+      <w:r>
+        <w:t>order_item_options</w:t>
+      </w:r>
+      <w:proofErr w:type="spellEnd"/>
+      <w:r>
+        <w:t xml:space="preserve"> in full via </w:t>
+      </w:r>
+      <w:proofErr w:type="spellStart"/>
+      <w:r>
+        <w:t>dbtable</w:t>
+      </w:r>
+      <w:proofErr w:type="spellEnd"/>
+      <w:r>
+        <w:t xml:space="preserve">, filters/joins in Spark against the checkpoint, and writes only new rows to S3 raw/ (skipped entirely if zero new rows). </w:t>
+      </w:r>
+      <w:proofErr w:type="spellStart"/>
+      <w:r>
+        <w:t>date_dim</w:t>
+      </w:r>
+      <w:proofErr w:type="spellEnd"/>
+      <w:r>
+        <w:t xml:space="preserve"> is pulled and written in full on every run, unconditionally. All three writes use .coalesce(1) to produce a single output file per table per run, after an initial run fragmented output into 20 files (</w:t>
+      </w:r>
+      <w:proofErr w:type="spellStart"/>
+      <w:r>
+        <w:t>date_dim</w:t>
+      </w:r>
+      <w:proofErr w:type="spellEnd"/>
+      <w:r>
+        <w:t>) and 4 files (</w:t>
+      </w:r>
+      <w:proofErr w:type="spellStart"/>
+      <w:r>
+        <w:t>order_item_options</w:t>
+      </w:r>
+      <w:proofErr w:type="spellEnd"/>
+      <w:r>
+        <w:t>) — confirmed via direct row-count verification to be Spark's default output partitioning, not duplicate data.</w:t>
+      </w:r>
+    </w:p>
+    <w:p>
+      <w:pPr>
+        <w:spacing w:after="160"/>
+      </w:pPr>
+      <w:r>
+        <w:lastRenderedPageBreak/>
+        <w:t xml:space="preserve">Verified: incremental filter behavior. After the initial full historical load, a subsequent run against an unchanged source correctly returned zero new rows for both </w:t>
+      </w:r>
+      <w:proofErr w:type="spellStart"/>
+      <w:r>
+        <w:t>order_items</w:t>
+      </w:r>
+      <w:proofErr w:type="spellEnd"/>
+      <w:r>
+        <w:t xml:space="preserve"> and </w:t>
+      </w:r>
+      <w:proofErr w:type="spellStart"/>
+      <w:r>
+        <w:t>order_item_options</w:t>
+      </w:r>
+      <w:proofErr w:type="spellEnd"/>
+      <w:r>
+        <w:t xml:space="preserve"> and skipped the S3 write entirely, confirmed via job log output. </w:t>
+      </w:r>
+      <w:proofErr w:type="spellStart"/>
+      <w:r>
+        <w:t>date_dim</w:t>
+      </w:r>
+      <w:proofErr w:type="spellEnd"/>
+      <w:r>
+        <w:t xml:space="preserve"> continued writing its full 365 rows on this same run, as expected given its unconditional design.</w:t>
+      </w:r>
+    </w:p>
+    <w:p>
+      <w:pPr>
+        <w:spacing w:after="160"/>
+      </w:pPr>
+      <w:r>
+        <w:t>Known operational gotcha: deleting raw/ output without resetting the checkpoint creates a data gap. Because the checkpoint tracks source watermark position only (not destination file state), deleting already-extracted raw/ files without also resetting the SSM checkpoint parameter leaves the historical dataset absent from S3 (present only in RDS), since a subsequent run correctly finds zero new rows and writes nothing. Recovery requires manually resetting the checkpoint to force a full historical re-pull.</w:t>
+      </w:r>
+    </w:p>
+    <w:p>
+      <w:pPr>
+        <w:spacing w:after="160"/>
+      </w:pPr>
+      <w:r>
+        <w:rPr>
+          <w:b/>
+          <w:bCs/>
+        </w:rPr>
+        <w:t xml:space="preserve">Transform (Glue ETL, </w:t>
+      </w:r>
+      <w:proofErr w:type="spellStart"/>
+      <w:r>
+        <w:rPr>
+          <w:b/>
+          <w:bCs/>
+        </w:rPr>
+        <w:t>PySpark</w:t>
+      </w:r>
+      <w:proofErr w:type="spellEnd"/>
+      <w:r>
+        <w:rPr>
+          <w:b/>
+          <w:bCs/>
+        </w:rPr>
+        <w:t>) — built, deployed, and verified</w:t>
+      </w:r>
+    </w:p>
+    <w:p>
+      <w:pPr>
+        <w:spacing w:after="160"/>
+      </w:pPr>
+      <w:r>
+        <w:t xml:space="preserve">Reads all raw/ partitions in one pass (recurse=True), standardizes column names to lowercase </w:t>
+      </w:r>
+      <w:proofErr w:type="spellStart"/>
+      <w:r>
+        <w:t>snake_case</w:t>
+      </w:r>
+      <w:proofErr w:type="spellEnd"/>
+      <w:r>
+        <w:t xml:space="preserve"> (source columns are UPPERCASE), and writes three separately cleaned tables to processed/ — </w:t>
+      </w:r>
+      <w:proofErr w:type="spellStart"/>
+      <w:r>
+        <w:t>order_items</w:t>
+      </w:r>
+      <w:proofErr w:type="spellEnd"/>
+      <w:r>
+        <w:t xml:space="preserve">, </w:t>
+      </w:r>
+      <w:proofErr w:type="spellStart"/>
+      <w:r>
+        <w:t>order_item_options</w:t>
+      </w:r>
+      <w:proofErr w:type="spellEnd"/>
+      <w:r>
+        <w:t xml:space="preserve">, and </w:t>
+      </w:r>
+      <w:proofErr w:type="spellStart"/>
+      <w:r>
+        <w:t>date_dim</w:t>
+      </w:r>
+      <w:proofErr w:type="spellEnd"/>
+      <w:r>
+        <w:t xml:space="preserve"> — using full-overwrite semantics (</w:t>
+      </w:r>
+      <w:proofErr w:type="spellStart"/>
+      <w:r>
+        <w:t>spark.write.mode</w:t>
+      </w:r>
+      <w:proofErr w:type="spellEnd"/>
+      <w:r>
+        <w:t xml:space="preserve">("overwrite")) rather than the extract job's append pattern, since processed/ should reflect the current full rebuild, not accumulate every run's output. Deliberately does NOT join </w:t>
+      </w:r>
+      <w:proofErr w:type="spellStart"/>
+      <w:r>
+        <w:t>order_items</w:t>
+      </w:r>
+      <w:proofErr w:type="spellEnd"/>
+      <w:r>
+        <w:t xml:space="preserve"> to </w:t>
+      </w:r>
+      <w:proofErr w:type="spellStart"/>
+      <w:r>
+        <w:t>order_item_options</w:t>
+      </w:r>
+      <w:proofErr w:type="spellEnd"/>
+      <w:r>
+        <w:t xml:space="preserve"> at this stage: </w:t>
+      </w:r>
+      <w:proofErr w:type="spellStart"/>
+      <w:r>
+        <w:t>order_item_options</w:t>
+      </w:r>
+      <w:proofErr w:type="spellEnd"/>
+      <w:r>
+        <w:t xml:space="preserve"> is a child table (multiple options per line item), and joining now would silently fan out </w:t>
+      </w:r>
+      <w:proofErr w:type="spellStart"/>
+      <w:r>
+        <w:t>order_items</w:t>
+      </w:r>
+      <w:proofErr w:type="spellEnd"/>
+      <w:r>
+        <w:t xml:space="preserve">' grain. The join is deferred to the aggregate layer, same pattern used on the Healthcare Metrics project (“join between PBJ and </w:t>
+      </w:r>
+      <w:proofErr w:type="spellStart"/>
+      <w:r>
+        <w:t>ProviderInfo</w:t>
+      </w:r>
+      <w:proofErr w:type="spellEnd"/>
+      <w:r>
+        <w:t xml:space="preserve"> deferred to Athena CTAS layer”).</w:t>
+      </w:r>
+    </w:p>
+    <w:p>
+      <w:pPr>
+        <w:spacing w:after="160"/>
+      </w:pPr>
+      <w:r>
+        <w:t xml:space="preserve">Date parsing: </w:t>
+      </w:r>
+      <w:proofErr w:type="spellStart"/>
+      <w:r>
+        <w:t>order_items.CREATION_TIME_UTC</w:t>
+      </w:r>
+      <w:proofErr w:type="spellEnd"/>
+      <w:r>
+        <w:t xml:space="preserve"> is ISO 8601 but not uniformly formatted — 187 of 203,519 rows (0.09%) are whole-second timestamps with no fractional-second component at all (e.g. 2023-05-04T10:31:19Z vs. the more common 2023-03-08T11:03:32.223Z), which failed a single strict '.SSS' parse pattern despite being valid ISO 8601. Confirmed via direct inspection (pandas' lenient ISO8601 parser found zero failures across all 203,519 rows, isolating the issue to Spark's strict single-pattern parsing, not the data itself). Fixed via </w:t>
+      </w:r>
+      <w:proofErr w:type="spellStart"/>
+      <w:r>
+        <w:t>F.coalesce</w:t>
+      </w:r>
+      <w:proofErr w:type="spellEnd"/>
+      <w:r>
+        <w:t xml:space="preserve">() trying two explicit formats (with and without milliseconds) rather than assuming one. </w:t>
+      </w:r>
+      <w:proofErr w:type="spellStart"/>
+      <w:r>
+        <w:t>date_dim.date_key</w:t>
+      </w:r>
+      <w:proofErr w:type="spellEnd"/>
+      <w:r>
+        <w:t xml:space="preserve"> is stored as DD-MM-YYYY text, not ISO — confirmed via direct inspection, not assumed — and is parsed explicitly via </w:t>
+      </w:r>
+      <w:proofErr w:type="spellStart"/>
+      <w:r>
+        <w:t>to_date</w:t>
+      </w:r>
+      <w:proofErr w:type="spellEnd"/>
+      <w:r>
+        <w:t>(col, ‘dd-MM-</w:t>
+      </w:r>
+      <w:proofErr w:type="spellStart"/>
+      <w:r>
+        <w:t>yyyy</w:t>
+      </w:r>
+      <w:proofErr w:type="spellEnd"/>
+      <w:r>
+        <w:t>’) rather than relying on string comparison, which would not sort/compare correctly as plain text.</w:t>
+      </w:r>
+    </w:p>
+    <w:p>
+      <w:pPr>
+        <w:spacing w:after="160"/>
+      </w:pPr>
+      <w:r>
+        <w:rPr>
+          <w:b/>
+          <w:bCs/>
+        </w:rPr>
+        <w:t xml:space="preserve">Aggregate (Glue ETL, </w:t>
+      </w:r>
+      <w:proofErr w:type="spellStart"/>
+      <w:r>
+        <w:rPr>
+          <w:b/>
+          <w:bCs/>
+        </w:rPr>
+        <w:t>PySpark</w:t>
+      </w:r>
+      <w:proofErr w:type="spellEnd"/>
+      <w:r>
+        <w:rPr>
+          <w:b/>
+          <w:bCs/>
+        </w:rPr>
+        <w:t>) — all seven marts built, individually validated, deployed</w:t>
+      </w:r>
+    </w:p>
+    <w:p>
+      <w:pPr>
+        <w:spacing w:after="160"/>
+      </w:pPr>
+      <w:r>
+        <w:t xml:space="preserve">All aggregation logic runs in </w:t>
+      </w:r>
+      <w:proofErr w:type="spellStart"/>
+      <w:r>
+        <w:t>PySpark</w:t>
+      </w:r>
+      <w:proofErr w:type="spellEnd"/>
+      <w:r>
+        <w:t xml:space="preserve"> within a single Glue ETL job, not via Athena CTAS — a deliberate divergence from the Healthcare Metrics project's approach, driven by this project's explicit “all logics should be done using PYSPARK” requirement. Athena's role is limited to read-only querying of the finished marts/ tables for </w:t>
+      </w:r>
+      <w:proofErr w:type="spellStart"/>
+      <w:r>
+        <w:t>QuickSight</w:t>
+      </w:r>
+      <w:proofErr w:type="spellEnd"/>
+      <w:r>
+        <w:t xml:space="preserve">. This is the first point in the pipeline where </w:t>
+      </w:r>
+      <w:proofErr w:type="spellStart"/>
+      <w:r>
+        <w:t>order_items</w:t>
+      </w:r>
+      <w:proofErr w:type="spellEnd"/>
+      <w:r>
+        <w:t xml:space="preserve"> and </w:t>
+      </w:r>
+      <w:proofErr w:type="spellStart"/>
+      <w:r>
+        <w:t>order_item_options</w:t>
+      </w:r>
+      <w:proofErr w:type="spellEnd"/>
+      <w:r>
+        <w:t xml:space="preserve"> are joined. Each of the seven metrics is wrapped in try/except so a failure in one does not block the others from completing in the same run; the job still correctly reports overall failure if any metric failed, so Glue Workflow's retry logic sees an accurate signal even though successfully-computed marts are not rolled back.</w:t>
+      </w:r>
+    </w:p>
+    <w:p>
+      <w:pPr>
+        <w:pStyle w:val="Heading1"/>
+        <w:spacing w:before="280" w:after="140"/>
+      </w:pPr>
+      <w:r>
+        <w:t xml:space="preserve">8.1 Data Quality Flag: </w:t>
+      </w:r>
+      <w:proofErr w:type="spellStart"/>
+      <w:r>
+        <w:t>is_likely_non_individual</w:t>
+      </w:r>
+      <w:proofErr w:type="spellEnd"/>
+    </w:p>
+    <w:p>
+      <w:pPr>
+        <w:spacing w:after="160"/>
+      </w:pPr>
+      <w:r>
+        <w:t xml:space="preserve">A loyalty-consistency check (investigating why </w:t>
+      </w:r>
+      <w:proofErr w:type="spellStart"/>
+      <w:r>
+        <w:t>is_loyalty</w:t>
+      </w:r>
+      <w:proofErr w:type="spellEnd"/>
+      <w:r>
+        <w:t xml:space="preserve"> is not a stable per-customer attribute — 2,783 customers showed both True and False across different orders) surfaced a small number of </w:t>
+      </w:r>
+      <w:proofErr w:type="spellStart"/>
+      <w:r>
+        <w:t>user_ids</w:t>
+      </w:r>
+      <w:proofErr w:type="spellEnd"/>
+      <w:r>
+        <w:t xml:space="preserve"> with implausible order volume: 700–2,500+ line items across the dataset's ~4-year span, several spanning 6–19 distinct </w:t>
+      </w:r>
+      <w:proofErr w:type="spellStart"/>
+      <w:r>
+        <w:t>restaurant_ids</w:t>
+      </w:r>
+      <w:proofErr w:type="spellEnd"/>
+      <w:r>
+        <w:t xml:space="preserve">, mostly with no </w:t>
+      </w:r>
+      <w:proofErr w:type="spellStart"/>
+      <w:r>
+        <w:t>printed_card_number</w:t>
+      </w:r>
+      <w:proofErr w:type="spellEnd"/>
+      <w:r>
+        <w:t xml:space="preserve"> on file, with one account ordering on 81% of all days in its active window and another tied to just 1–2 restaurant locations placing near-daily orders for roughly two years. This pattern is far more consistent with a corporate/default/no-login account than an individual customer.</w:t>
+      </w:r>
+    </w:p>
+    <w:p>
+      <w:pPr>
+        <w:spacing w:after="160"/>
+      </w:pPr>
+      <w:r>
+        <w:t>Independently verified against the source RDS data directly (not a pipeline artifact) — exact count matches between SQL Server and the processed S3 output for all 10 directly-investigated accounts, ruling out a duplication bug anywhere in extract or transform.</w:t>
+      </w:r>
+    </w:p>
+    <w:p>
+      <w:pPr>
+        <w:spacing w:after="160"/>
+      </w:pPr>
+      <w:r>
+        <w:t>Threshold (500 line items) chosen from the actual distribution shape, not a round number: the customer base shows a smooth, continuous long tail through the 99.9th percentile (372 line items — plausible for a genuinely frequent weekly customer over 4 years), then a sharp discontinuity to the 99.99th percentile (1,131) — a different population, not a continuation of the same trend. 19 of 20,174 customers (0.094%) are flagged, holding 9.48% of total line-item volume.</w:t>
+      </w:r>
+    </w:p>
+    <w:p>
+      <w:pPr>
+        <w:spacing w:after="160"/>
+      </w:pPr>
+      <w:r>
+        <w:t xml:space="preserve">Implemented as a FLAG, joined onto </w:t>
+      </w:r>
+      <w:proofErr w:type="spellStart"/>
+      <w:r>
+        <w:t>clv_daily</w:t>
+      </w:r>
+      <w:proofErr w:type="spellEnd"/>
+      <w:r>
+        <w:t xml:space="preserve">, </w:t>
+      </w:r>
+      <w:proofErr w:type="spellStart"/>
+      <w:r>
+        <w:t>customer_segments_rfm</w:t>
+      </w:r>
+      <w:proofErr w:type="spellEnd"/>
+      <w:r>
+        <w:t xml:space="preserve">, and </w:t>
+      </w:r>
+      <w:proofErr w:type="spellStart"/>
+      <w:r>
+        <w:t>churn_risk</w:t>
+      </w:r>
+      <w:proofErr w:type="spellEnd"/>
+      <w:r>
+        <w:t xml:space="preserve"> — not a filter. No rows are excluded from any mart. Whether these represent known corporate/catering accounts or a data quality issue to exclude is an open question, to be raised with the SME once the full pipeline is complete (per direction received during development).</w:t>
+      </w:r>
+    </w:p>
+    <w:p>
+      <w:pPr>
+        <w:pStyle w:val="Heading1"/>
+        <w:spacing w:before="280" w:after="140"/>
+      </w:pPr>
+      <w:r>
+        <w:lastRenderedPageBreak/>
+        <w:t>8.2 Mart-by-Mart Summary</w:t>
+      </w:r>
+    </w:p>
+    <w:p>
+      <w:pPr>
+        <w:spacing w:after="160"/>
+      </w:pPr>
+      <w:proofErr w:type="spellStart"/>
+      <w:r>
+        <w:rPr>
+          <w:b/>
+          <w:bCs/>
+        </w:rPr>
+        <w:t>clv_daily</w:t>
+      </w:r>
+      <w:proofErr w:type="spellEnd"/>
+      <w:r>
+        <w:rPr>
+          <w:b/>
+          <w:bCs/>
+        </w:rPr>
+        <w:t xml:space="preserve"> — verified</w:t>
+      </w:r>
+    </w:p>
+    <w:p>
+      <w:pPr>
+        <w:spacing w:after="160"/>
+      </w:pPr>
+      <w:r>
+        <w:t xml:space="preserve">Grain: one row per </w:t>
+      </w:r>
+      <w:proofErr w:type="spellStart"/>
+      <w:r>
+        <w:t>user_id</w:t>
+      </w:r>
+      <w:proofErr w:type="spellEnd"/>
+      <w:r>
+        <w:t xml:space="preserve"> per order date the customer actually ordered on (not a full calendar spine of every day for every customer — on non-order days, cumulative CLV is unchanged by construction, so a forward-filled row adds no information a step chart can't already show; documented as a deliberate scale-driven simplification). Revenue per line item includes attached option prices, not just the base item price. </w:t>
+      </w:r>
+      <w:proofErr w:type="spellStart"/>
+      <w:r>
+        <w:t>user_id</w:t>
+      </w:r>
+      <w:proofErr w:type="spellEnd"/>
+      <w:r>
+        <w:t>-null line items excluded (17,808 of 203,519, 8.75%) — no customer to attribute spend to. Cumulative CLV computed via a Spark window function (</w:t>
+      </w:r>
+      <w:proofErr w:type="spellStart"/>
+      <w:r>
+        <w:t>partitionBy</w:t>
+      </w:r>
+      <w:proofErr w:type="spellEnd"/>
+      <w:r>
+        <w:t>(</w:t>
+      </w:r>
+      <w:proofErr w:type="spellStart"/>
+      <w:r>
+        <w:t>user_id</w:t>
+      </w:r>
+      <w:proofErr w:type="spellEnd"/>
+      <w:r>
+        <w:t>).</w:t>
+      </w:r>
+      <w:proofErr w:type="spellStart"/>
+      <w:r>
+        <w:t>orderBy</w:t>
+      </w:r>
+      <w:proofErr w:type="spellEnd"/>
+      <w:r>
+        <w:t>(</w:t>
+      </w:r>
+      <w:proofErr w:type="spellStart"/>
+      <w:r>
+        <w:t>order_date</w:t>
+      </w:r>
+      <w:proofErr w:type="spellEnd"/>
+      <w:r>
+        <w:t>), running sum). Verified: downloaded output confirmed cumulative CLV is monotonically non-decreasing for every one of 20,174 customers (0 violations) — direct proof of correct window-function behavior, not just “ran without error.” 100,084 rows written.</w:t>
+      </w:r>
+    </w:p>
+    <w:p>
+      <w:pPr>
+        <w:spacing w:after="160"/>
+      </w:pPr>
+      <w:proofErr w:type="spellStart"/>
+      <w:r>
+        <w:rPr>
+          <w:b/>
+          <w:bCs/>
+        </w:rPr>
+        <w:t>customer_segments_rfm</w:t>
+      </w:r>
+      <w:proofErr w:type="spellEnd"/>
+      <w:r>
+        <w:rPr>
+          <w:b/>
+          <w:bCs/>
+        </w:rPr>
+        <w:t xml:space="preserve"> — verified</w:t>
+      </w:r>
+    </w:p>
+    <w:p>
+      <w:pPr>
+        <w:spacing w:after="160"/>
+      </w:pPr>
+      <w:r>
+        <w:t xml:space="preserve">Grain: one row per customer (snapshot). Reference date for recency = the dataset's own most recent order date, since “today” isn't meaningful for static historical data (a live/production version would anchor to the actual current date). Quintile scoring (1–5, 5=best) via Spark's </w:t>
+      </w:r>
+      <w:proofErr w:type="spellStart"/>
+      <w:r>
+        <w:t>ntile</w:t>
+      </w:r>
+      <w:proofErr w:type="spellEnd"/>
+      <w:r>
+        <w:t xml:space="preserve">(5); recency score inverted (6 − bucket) to keep “5 = best” consistent across all three dimensions. Segment labels (VIP/New/Churn Risk/Regular) match the requirements doc's dashboard language; “New” is based on true lifetime order count (exactly one order ever), not merely a low frequency score. Verified: 20,174 rows exactly matching distinct customer count, all three scores confirmed in valid 1–5 range with zero nulls, </w:t>
+      </w:r>
+      <w:proofErr w:type="spellStart"/>
+      <w:r>
+        <w:t>recency_days</w:t>
+      </w:r>
+      <w:proofErr w:type="spellEnd"/>
+      <w:r>
+        <w:t xml:space="preserve"> confirmed non-negative for every customer, “New” segment's frequency=1 invariant confirmed with zero violations. Segment distribution: Regular 7,787, Churn Risk 5,770, VIP 3,810, New 2,807.</w:t>
+      </w:r>
+    </w:p>
+    <w:p>
+      <w:pPr>
+        <w:spacing w:after="160"/>
+      </w:pPr>
+      <w:proofErr w:type="spellStart"/>
+      <w:r>
+        <w:rPr>
+          <w:b/>
+          <w:bCs/>
+        </w:rPr>
+        <w:t>churn_risk</w:t>
+      </w:r>
+      <w:proofErr w:type="spellEnd"/>
+      <w:r>
+        <w:rPr>
+          <w:b/>
+          <w:bCs/>
+        </w:rPr>
+        <w:t xml:space="preserve"> — verified</w:t>
+      </w:r>
+    </w:p>
+    <w:p>
+      <w:pPr>
+        <w:spacing w:after="160"/>
+      </w:pPr>
+      <w:r>
+        <w:t xml:space="preserve">Grain: one row per customer, reusing RFM's </w:t>
+      </w:r>
+      <w:proofErr w:type="spellStart"/>
+      <w:r>
+        <w:t>recency_days</w:t>
+      </w:r>
+      <w:proofErr w:type="spellEnd"/>
+      <w:r>
+        <w:t xml:space="preserve">/reference-date basis. Two complementary signals: </w:t>
+      </w:r>
+      <w:proofErr w:type="spellStart"/>
+      <w:r>
+        <w:t>risk_tier</w:t>
+      </w:r>
+      <w:proofErr w:type="spellEnd"/>
+      <w:r>
+        <w:t xml:space="preserve"> (Active/At Risk/Churned via fixed 30/90-day thresholds — a business assumption for a frequent-order food category, worth tuning with real stakeholder input) and </w:t>
+      </w:r>
+      <w:proofErr w:type="spellStart"/>
+      <w:r>
+        <w:t>is_overdue</w:t>
+      </w:r>
+      <w:proofErr w:type="spellEnd"/>
+      <w:r>
+        <w:t xml:space="preserve"> (behavioral — flags customers who have gone quiet relative to their OWN historical ordering cadence, approximated as total order-date span ÷ distinct order days, rather than everyone judged against the same fixed thresholds). Verified: median </w:t>
+      </w:r>
+      <w:proofErr w:type="spellStart"/>
+      <w:r>
+        <w:t>recency_days</w:t>
+      </w:r>
+      <w:proofErr w:type="spellEnd"/>
+      <w:r>
+        <w:t xml:space="preserve"> confirmed strictly increasing across tiers (Active 12, At Risk 57, Churned 446 — proof the tier logic behaves correctly, not just plausible labels), and </w:t>
+      </w:r>
+      <w:proofErr w:type="spellStart"/>
+      <w:r>
+        <w:t>is_overdue</w:t>
+      </w:r>
+      <w:proofErr w:type="spellEnd"/>
+      <w:r>
+        <w:t xml:space="preserve"> independently recomputed in a separate validation pass and matched the job's own output with zero discrepancies across all 20,174 customers. Known interpretive caveat: 81% of customers show as “Churned” — a structural consequence of measuring against a single fixed historical reference date across a ~4-year static dataset, not necessarily reflective of true churn rate in a live system; worth calling out explicitly on any dashboard surfacing this figure.</w:t>
+      </w:r>
+    </w:p>
+    <w:p>
+      <w:pPr>
+        <w:spacing w:after="160"/>
+      </w:pPr>
+      <w:proofErr w:type="spellStart"/>
+      <w:r>
+        <w:rPr>
+          <w:b/>
+          <w:bCs/>
+        </w:rPr>
+        <w:t>sales_trends</w:t>
+      </w:r>
+      <w:proofErr w:type="spellEnd"/>
+      <w:r>
+        <w:rPr>
+          <w:b/>
+          <w:bCs/>
+        </w:rPr>
+        <w:t xml:space="preserve"> — verified</w:t>
+      </w:r>
+    </w:p>
+    <w:p>
+      <w:pPr>
+        <w:spacing w:after="160"/>
+      </w:pPr>
+      <w:r>
+        <w:t>Grain: one row per calendar date (business-level, not per-customer) — total revenue, order count, average order value per day. Unlike every customer-level metric, null-</w:t>
+      </w:r>
+      <w:proofErr w:type="spellStart"/>
+      <w:r>
+        <w:t>user_id</w:t>
+      </w:r>
+      <w:proofErr w:type="spellEnd"/>
+      <w:r>
+        <w:t xml:space="preserve"> line items are INCLUDED, not excluded: an order with no attached customer is still real revenue that occurred on that day. Calendar attributes for </w:t>
+      </w:r>
+      <w:proofErr w:type="spellStart"/>
+      <w:r>
+        <w:t>QuickSight's</w:t>
+      </w:r>
+      <w:proofErr w:type="spellEnd"/>
+      <w:r>
+        <w:t xml:space="preserve"> native date-hierarchy drill (</w:t>
+      </w:r>
+      <w:proofErr w:type="spellStart"/>
+      <w:r>
+        <w:t>Year→Month→Day</w:t>
+      </w:r>
+      <w:proofErr w:type="spellEnd"/>
+      <w:r>
+        <w:t xml:space="preserve">) rather than separate pre-aggregated weekly/monthly tables. Verified: no negative revenue or non-positive order counts across 1,336 distinct dates spanning 2020-04-21 to 2024-02-21; </w:t>
+      </w:r>
+      <w:proofErr w:type="spellStart"/>
+      <w:r>
+        <w:t>avg_order_value</w:t>
+      </w:r>
+      <w:proofErr w:type="spellEnd"/>
+      <w:r>
+        <w:t xml:space="preserve"> independently recomputed with zero discrepancies. Grand totals: $10,018,999.82 revenue, 131,328 orders — these two figures serve as the reconciliation baseline for </w:t>
+      </w:r>
+      <w:proofErr w:type="spellStart"/>
+      <w:r>
+        <w:t>loyalty_impact</w:t>
+      </w:r>
+      <w:proofErr w:type="spellEnd"/>
+      <w:r>
+        <w:t xml:space="preserve"> and </w:t>
+      </w:r>
+      <w:proofErr w:type="spellStart"/>
+      <w:r>
+        <w:t>location_performance</w:t>
+      </w:r>
+      <w:proofErr w:type="spellEnd"/>
+      <w:r>
+        <w:t xml:space="preserve"> below.</w:t>
+      </w:r>
+    </w:p>
+    <w:p>
+      <w:pPr>
+        <w:spacing w:after="160"/>
+      </w:pPr>
+      <w:r>
+        <w:rPr>
+          <w:b/>
+          <w:bCs/>
+        </w:rPr>
+        <w:t xml:space="preserve">Cross-cutting fix: </w:t>
+      </w:r>
+      <w:proofErr w:type="spellStart"/>
+      <w:r>
+        <w:rPr>
+          <w:b/>
+          <w:bCs/>
+        </w:rPr>
+        <w:t>date_dim</w:t>
+      </w:r>
+      <w:proofErr w:type="spellEnd"/>
+      <w:r>
+        <w:rPr>
+          <w:b/>
+          <w:bCs/>
+        </w:rPr>
+        <w:t xml:space="preserve"> coverage gap</w:t>
+      </w:r>
+    </w:p>
+    <w:p>
+      <w:pPr>
+        <w:spacing w:after="160"/>
+      </w:pPr>
+      <w:r>
+        <w:t xml:space="preserve">The source </w:t>
+      </w:r>
+      <w:proofErr w:type="spellStart"/>
+      <w:r>
+        <w:t>date_dim</w:t>
+      </w:r>
+      <w:proofErr w:type="spellEnd"/>
+      <w:r>
+        <w:t xml:space="preserve"> contains only 365 rows (roughly one year), while order data spans ~3.8 years. A straight join to </w:t>
+      </w:r>
+      <w:proofErr w:type="spellStart"/>
+      <w:r>
+        <w:t>date_dim</w:t>
+      </w:r>
+      <w:proofErr w:type="spellEnd"/>
+      <w:r>
+        <w:t xml:space="preserve"> for calendar attributes (as originally implemented in both </w:t>
+      </w:r>
+      <w:proofErr w:type="spellStart"/>
+      <w:r>
+        <w:t>clv_daily</w:t>
+      </w:r>
+      <w:proofErr w:type="spellEnd"/>
+      <w:r>
+        <w:t xml:space="preserve"> and </w:t>
+      </w:r>
+      <w:proofErr w:type="spellStart"/>
+      <w:r>
+        <w:t>sales_trends</w:t>
+      </w:r>
+      <w:proofErr w:type="spellEnd"/>
+      <w:r>
+        <w:t>) silently nulled year/month/week/day-of-week/weekend flags for 73% of dates (971 of 1,336) — caught via direct validation, not assumed. Fixed by deriving year/month/week/</w:t>
+      </w:r>
+      <w:proofErr w:type="spellStart"/>
+      <w:r>
+        <w:t>day_of_week</w:t>
+      </w:r>
+      <w:proofErr w:type="spellEnd"/>
+      <w:r>
+        <w:t>/</w:t>
+      </w:r>
+      <w:proofErr w:type="spellStart"/>
+      <w:r>
+        <w:t>is_weekend</w:t>
+      </w:r>
+      <w:proofErr w:type="spellEnd"/>
+      <w:r>
+        <w:t xml:space="preserve"> directly from each date via Spark's built-in date functions (mechanically correct for any year), joining </w:t>
+      </w:r>
+      <w:proofErr w:type="spellStart"/>
+      <w:r>
+        <w:t>date_dim</w:t>
+      </w:r>
+      <w:proofErr w:type="spellEnd"/>
+      <w:r>
+        <w:t xml:space="preserve"> only for </w:t>
+      </w:r>
+      <w:proofErr w:type="spellStart"/>
+      <w:r>
+        <w:t>is_holiday</w:t>
+      </w:r>
+      <w:proofErr w:type="spellEnd"/>
+      <w:r>
+        <w:t>/</w:t>
+      </w:r>
+      <w:proofErr w:type="spellStart"/>
+      <w:r>
+        <w:t>holiday_name</w:t>
+      </w:r>
+      <w:proofErr w:type="spellEnd"/>
+      <w:r>
+        <w:t>, which genuinely requires the source data and remains null outside its actual coverage — a narrower, explicitly documented gap rather than a silent, broad one. Re-verified after the fix: 0 of 1,336 dates null, down from 971.</w:t>
+      </w:r>
+    </w:p>
+    <w:p>
+      <w:pPr>
+        <w:spacing w:after="160"/>
+      </w:pPr>
+      <w:proofErr w:type="spellStart"/>
+      <w:r>
+        <w:rPr>
+          <w:b/>
+          <w:bCs/>
+        </w:rPr>
+        <w:t>loyalty_impact</w:t>
+      </w:r>
+      <w:proofErr w:type="spellEnd"/>
+      <w:r>
+        <w:rPr>
+          <w:b/>
+          <w:bCs/>
+        </w:rPr>
+        <w:t xml:space="preserve"> — verified</w:t>
+      </w:r>
+    </w:p>
+    <w:p>
+      <w:pPr>
+        <w:spacing w:after="160"/>
+      </w:pPr>
+      <w:r>
+        <w:t>Grain: (</w:t>
+      </w:r>
+      <w:proofErr w:type="spellStart"/>
+      <w:r>
+        <w:t>is_loyalty</w:t>
+      </w:r>
+      <w:proofErr w:type="spellEnd"/>
+      <w:r>
+        <w:t xml:space="preserve">, </w:t>
+      </w:r>
+      <w:proofErr w:type="spellStart"/>
+      <w:r>
+        <w:t>is_likely_non_individual</w:t>
+      </w:r>
+      <w:proofErr w:type="spellEnd"/>
+      <w:r>
+        <w:t xml:space="preserve">), order-level rather than customer-level — </w:t>
+      </w:r>
+      <w:proofErr w:type="spellStart"/>
+      <w:r>
+        <w:t>is_loyalty</w:t>
+      </w:r>
+      <w:proofErr w:type="spellEnd"/>
+      <w:r>
+        <w:t xml:space="preserve"> was confirmed inconsistent per customer (2,783 customers show both True and False across orders, mean 42% loyalty-flagged, std 0.25), so average CLV per loyalty group was deliberately excluded rather than forced onto a customer-level metric with an arbitrary per-</w:t>
+      </w:r>
+      <w:r>
+        <w:lastRenderedPageBreak/>
+        <w:t xml:space="preserve">customer loyalty rule; revenue/order-count/avg-order-value all work cleanly at the flag's actual order-level grain. Verified: summed revenue and order count across all four groups reconciled exactly against </w:t>
+      </w:r>
+      <w:proofErr w:type="spellStart"/>
+      <w:r>
+        <w:t>sales_trends's</w:t>
+      </w:r>
+      <w:proofErr w:type="spellEnd"/>
+      <w:r>
+        <w:t xml:space="preserve"> independently-computed grand totals ($10,018,999.82 / 131,328 orders). Notable finding: non-loyalty orders (excluding flagged accounts) average $78.53, versus $16.18 for loyalty-flagged orders — a ~5x difference worth surfacing to the SME rather than assuming a cause.</w:t>
+      </w:r>
+    </w:p>
+    <w:p>
+      <w:pPr>
+        <w:spacing w:after="160"/>
+      </w:pPr>
+      <w:proofErr w:type="spellStart"/>
+      <w:r>
+        <w:rPr>
+          <w:b/>
+          <w:bCs/>
+        </w:rPr>
+        <w:t>location_performance</w:t>
+      </w:r>
+      <w:proofErr w:type="spellEnd"/>
+      <w:r>
+        <w:rPr>
+          <w:b/>
+          <w:bCs/>
+        </w:rPr>
+        <w:t xml:space="preserve"> — verified</w:t>
+      </w:r>
+    </w:p>
+    <w:p>
+      <w:pPr>
+        <w:spacing w:after="160"/>
+      </w:pPr>
+      <w:r>
+        <w:t xml:space="preserve">Grain: one row per </w:t>
+      </w:r>
+      <w:proofErr w:type="spellStart"/>
+      <w:r>
+        <w:t>restaurant_id</w:t>
+      </w:r>
+      <w:proofErr w:type="spellEnd"/>
+      <w:r>
+        <w:t xml:space="preserve">, business-level like </w:t>
+      </w:r>
+      <w:proofErr w:type="spellStart"/>
+      <w:r>
+        <w:t>sales_trends</w:t>
+      </w:r>
+      <w:proofErr w:type="spellEnd"/>
+      <w:r>
+        <w:t xml:space="preserve">. </w:t>
+      </w:r>
+      <w:proofErr w:type="spellStart"/>
+      <w:r>
+        <w:t>is_likely_non_individual</w:t>
+      </w:r>
+      <w:proofErr w:type="spellEnd"/>
+      <w:r>
+        <w:t xml:space="preserve"> surfaced as informational columns (flagged-account revenue/order count and share) rather than a second grouping dimension, since its impact varies sharply by location. Verified: revenue and order count reconciled exactly against </w:t>
+      </w:r>
+      <w:proofErr w:type="spellStart"/>
+      <w:r>
+        <w:t>sales_trends's</w:t>
+      </w:r>
+      <w:proofErr w:type="spellEnd"/>
+      <w:r>
+        <w:t xml:space="preserve"> grand totals; </w:t>
+      </w:r>
+      <w:proofErr w:type="spellStart"/>
+      <w:r>
+        <w:t>avg_order_value</w:t>
+      </w:r>
+      <w:proofErr w:type="spellEnd"/>
+      <w:r>
+        <w:t xml:space="preserve"> matched </w:t>
+      </w:r>
+      <w:proofErr w:type="spellStart"/>
+      <w:r>
+        <w:t>recomputation</w:t>
+      </w:r>
+      <w:proofErr w:type="spellEnd"/>
+      <w:r>
+        <w:t xml:space="preserve"> with zero discrepancies. Notable findings: one location accounts for ~53% of total business revenue ($5.35M of $10.02M) — worth confirming with the SME whether this reflects the real business or a dataset artifact — and 44% of that location's revenue comes from the 19 flagged accounts, consistent with the earlier finding that some flagged accounts are tied to just 1–2 restaurant locations.</w:t>
+      </w:r>
+    </w:p>
+    <w:p>
+      <w:pPr>
+        <w:spacing w:after="160"/>
+      </w:pPr>
+      <w:proofErr w:type="spellStart"/>
+      <w:r>
+        <w:rPr>
+          <w:b/>
+          <w:bCs/>
+        </w:rPr>
+        <w:t>discount_effectiveness</w:t>
+      </w:r>
+      <w:proofErr w:type="spellEnd"/>
+      <w:r>
+        <w:rPr>
+          <w:b/>
+          <w:bCs/>
+        </w:rPr>
+        <w:t xml:space="preserve"> — scope substituted, verified</w:t>
+      </w:r>
+    </w:p>
+    <w:p>
+      <w:pPr>
+        <w:spacing w:after="160"/>
+      </w:pPr>
+      <w:r>
+        <w:t>The source data has no discount, promo, or price-adjustment field of any kind, and no negative-price pattern indicating a discount was ever applied — confirmed via direct inspection (</w:t>
+      </w:r>
+      <w:proofErr w:type="spellStart"/>
+      <w:r>
+        <w:t>item_price</w:t>
+      </w:r>
+      <w:proofErr w:type="spellEnd"/>
+      <w:r>
+        <w:t xml:space="preserve"> and </w:t>
+      </w:r>
+      <w:proofErr w:type="spellStart"/>
+      <w:r>
+        <w:t>option_price</w:t>
+      </w:r>
+      <w:proofErr w:type="spellEnd"/>
+      <w:r>
+        <w:t xml:space="preserve"> are entirely non-negative across the full dataset). </w:t>
+      </w:r>
+      <w:proofErr w:type="spellStart"/>
+      <w:r>
+        <w:t>option_price</w:t>
+      </w:r>
+      <w:proofErr w:type="spellEnd"/>
+      <w:r>
+        <w:t xml:space="preserve"> = 0 accounts for 66% of all option rows, but this is the normal pattern for free customization options (e.g., “No Cheese”), not discounts. </w:t>
+      </w:r>
+      <w:proofErr w:type="spellStart"/>
+      <w:r>
+        <w:t>item_price</w:t>
+      </w:r>
+      <w:proofErr w:type="spellEnd"/>
+      <w:r>
+        <w:t xml:space="preserve"> = 0 occurs on only 0.08% of order items (156 rows) — too sparse to represent a real discount program. Given no true discount signal exists, this mart was repurposed as a PRICE-TIER analysis (which price points drive the most volume/revenue) — the closest legitimate question this data can answer — and is explicitly not presented as literal discount effectiveness. This scope substitution is a known, deliberate limitation to be raised with the SME. A secondary finding was also computed (not materialized as a mart): average order value for orders containing a free item vs. those without, as a small-sample (156 orders) directional proxy for “does giving something away correlate with bigger baskets.”</w:t>
+      </w:r>
+    </w:p>
+    <w:p>
+      <w:pPr>
+        <w:pStyle w:val="Heading1"/>
+        <w:spacing w:before="280" w:after="140"/>
+      </w:pPr>
+      <w:r>
+        <w:t>9. Known Data Quality Issues</w:t>
       </w:r>
     </w:p>
     <w:p>
@@ -1035,19 +2339,35 @@
       </w:pPr>
       <w:proofErr w:type="spellStart"/>
       <w:r>
-        <w:t>dea</w:t>
-      </w:r>
-      <w:proofErr w:type="spellEnd"/>
-      <w:r>
-        <w:t xml:space="preserve">-global-partners-glue-extract-role — RDS → S3 raw/. The only role needing VPC networking permissions (via </w:t>
-      </w:r>
-      <w:proofErr w:type="spellStart"/>
-      <w:r>
-        <w:t>AWSGlueServiceRole</w:t>
-      </w:r>
-      <w:proofErr w:type="spellEnd"/>
-      <w:r>
-        <w:t xml:space="preserve"> plus the ec2:DescribeVpcs inline policy) and Secrets Manager access.</w:t>
+        <w:t>order_item_options</w:t>
+      </w:r>
+      <w:proofErr w:type="spellEnd"/>
+      <w:r>
+        <w:t xml:space="preserve"> → </w:t>
+      </w:r>
+      <w:proofErr w:type="spellStart"/>
+      <w:r>
+        <w:t>order_items</w:t>
+      </w:r>
+      <w:proofErr w:type="spellEnd"/>
+      <w:r>
+        <w:t xml:space="preserve"> join: 28 of 193,017 </w:t>
+      </w:r>
+      <w:proofErr w:type="spellStart"/>
+      <w:r>
+        <w:t>order_item_options</w:t>
+      </w:r>
+      <w:proofErr w:type="spellEnd"/>
+      <w:r>
+        <w:t xml:space="preserve"> rows (0.0145%) reference an ORDER_ID with no corresponding row in </w:t>
+      </w:r>
+      <w:proofErr w:type="spellStart"/>
+      <w:r>
+        <w:t>order_items</w:t>
+      </w:r>
+      <w:proofErr w:type="spellEnd"/>
+      <w:r>
+        <w:t xml:space="preserve"> at all (confirmed via LEFT JOIN diagnostic — true orphans). Excluded from the extract via the inner join; documented as a genuine source-data gap.</w:t>
       </w:r>
     </w:p>
     <w:p>
@@ -1061,11 +2381,11 @@
       </w:pPr>
       <w:proofErr w:type="spellStart"/>
       <w:r>
-        <w:t>dea</w:t>
-      </w:r>
-      <w:proofErr w:type="spellEnd"/>
-      <w:r>
-        <w:t>-global-partners-glue-transform-role — S3 raw/ → processed/. No VPC/Secrets Manager access needed.</w:t>
+        <w:t>date_dim.date_key</w:t>
+      </w:r>
+      <w:proofErr w:type="spellEnd"/>
+      <w:r>
+        <w:t xml:space="preserve"> is stored as a DD-MM-YYYY string, not ISO format — does not sort/compare correctly as plain text; parsed explicitly to a real date type in the transform stage (see Section 8).</w:t>
       </w:r>
     </w:p>
     <w:p>
@@ -1079,12 +2399,11 @@
       </w:pPr>
       <w:proofErr w:type="spellStart"/>
       <w:r>
-        <w:lastRenderedPageBreak/>
-        <w:t>dea</w:t>
-      </w:r>
-      <w:proofErr w:type="spellEnd"/>
-      <w:r>
-        <w:t>-global-partners-glue-aggregate-role — S3 processed/ → marts/.</w:t>
+        <w:t>order_items.CREATION_TIME_UTC</w:t>
+      </w:r>
+      <w:proofErr w:type="spellEnd"/>
+      <w:r>
+        <w:t xml:space="preserve"> has inconsistent fractional-second precision — 187 of 203,519 rows (0.09%) omit milliseconds entirely; resolved via coalesced multi-format parsing rather than a single assumed pattern (see Section 8).</w:t>
       </w:r>
     </w:p>
     <w:p>
@@ -1098,11 +2417,43 @@
       </w:pPr>
       <w:proofErr w:type="spellStart"/>
       <w:r>
-        <w:t>dea</w:t>
-      </w:r>
-      <w:proofErr w:type="spellEnd"/>
-      <w:r>
-        <w:t>-global-partners-glue-crawler-role — read across all three S3 layers, write to Glue Data Catalog.</w:t>
+        <w:t>date_dim</w:t>
+      </w:r>
+      <w:proofErr w:type="spellEnd"/>
+      <w:r>
+        <w:t xml:space="preserve"> covers only ~365 days against a ~3.8-year order history; calendar attributes (year/month/week/day-of-week/weekend) are derived directly from dates rather than joined from </w:t>
+      </w:r>
+      <w:proofErr w:type="spellStart"/>
+      <w:r>
+        <w:t>date_dim</w:t>
+      </w:r>
+      <w:proofErr w:type="spellEnd"/>
+      <w:r>
+        <w:t xml:space="preserve">, to avoid silently losing them for 73% of dates. Only </w:t>
+      </w:r>
+      <w:proofErr w:type="spellStart"/>
+      <w:r>
+        <w:t>is_holiday</w:t>
+      </w:r>
+      <w:proofErr w:type="spellEnd"/>
+      <w:r>
+        <w:t>/</w:t>
+      </w:r>
+      <w:proofErr w:type="spellStart"/>
+      <w:r>
+        <w:t>holiday_name</w:t>
+      </w:r>
+      <w:proofErr w:type="spellEnd"/>
+      <w:r>
+        <w:t xml:space="preserve"> remain genuinely null outside </w:t>
+      </w:r>
+      <w:proofErr w:type="spellStart"/>
+      <w:r>
+        <w:t>date_dim's</w:t>
+      </w:r>
+      <w:proofErr w:type="spellEnd"/>
+      <w:r>
+        <w:t xml:space="preserve"> actual coverage (see Section 8).</w:t>
       </w:r>
     </w:p>
     <w:p>
@@ -1114,429 +2465,8 @@
         </w:numPr>
         <w:spacing w:after="100"/>
       </w:pPr>
-      <w:proofErr w:type="spellStart"/>
-      <w:r>
-        <w:t>dea</w:t>
-      </w:r>
-      <w:proofErr w:type="spellEnd"/>
-      <w:r>
-        <w:t>-global-partners-</w:t>
-      </w:r>
-      <w:proofErr w:type="spellStart"/>
-      <w:r>
-        <w:t>github</w:t>
-      </w:r>
-      <w:proofErr w:type="spellEnd"/>
-      <w:r>
-        <w:t xml:space="preserve">-actions-role — federated via GitHub's OIDC provider (token.actions.githubusercontent.com), scoped to this repository/branch via a </w:t>
-      </w:r>
-      <w:proofErr w:type="spellStart"/>
-      <w:r>
-        <w:t>StringLike</w:t>
-      </w:r>
-      <w:proofErr w:type="spellEnd"/>
-      <w:r>
-        <w:t xml:space="preserve"> trust condition. No long-lived AWS credentials stored in GitHub.</w:t>
-      </w:r>
-    </w:p>
-    <w:p>
-      <w:pPr>
-        <w:spacing w:after="160"/>
-      </w:pPr>
-      <w:r>
-        <w:t>A permissions gap was found and fixed during initial job testing: the extract role's original policy only granted S3 access to raw/*, but Glue itself needs s3:GetObject on the script file (under scripts/*) as a bootstrap step, before the job's own code ever runs. This is a distinct requirement from what the job's runtime logic needs, and was not accounted for in the original least-privilege scoping. Fixed by adding a scripts/* read statement; the same gap will need the same fix applied proactively to the transform and aggregate roles once those jobs are built, rather than waiting to hit the identical error twice more.</w:t>
-      </w:r>
-    </w:p>
-    <w:p>
-      <w:pPr>
-        <w:pStyle w:val="Heading1"/>
-        <w:spacing w:before="280" w:after="140"/>
-      </w:pPr>
-      <w:r>
-        <w:t>8. ETL / Data Processing Plan</w:t>
-      </w:r>
-    </w:p>
-    <w:p>
-      <w:pPr>
-        <w:spacing w:after="160"/>
-      </w:pPr>
-      <w:r>
-        <w:rPr>
-          <w:b/>
-          <w:bCs/>
-        </w:rPr>
-        <w:t xml:space="preserve">Extract (Glue ETL, </w:t>
-      </w:r>
-      <w:proofErr w:type="spellStart"/>
-      <w:r>
-        <w:rPr>
-          <w:b/>
-          <w:bCs/>
-        </w:rPr>
-        <w:t>PySpark</w:t>
-      </w:r>
-      <w:proofErr w:type="spellEnd"/>
-      <w:r>
-        <w:rPr>
-          <w:b/>
-          <w:bCs/>
-        </w:rPr>
-        <w:t>) — built and validated</w:t>
-      </w:r>
-    </w:p>
-    <w:p>
-      <w:pPr>
-        <w:spacing w:after="160"/>
-      </w:pPr>
-      <w:r>
-        <w:t xml:space="preserve">Reads a checkpoint (last-extracted CREATION_TIME_UTC) from SSM Parameter Store, defaulting to 1900-01-01 if the parameter does not yet exist (first-run behavior). Pulls </w:t>
-      </w:r>
-      <w:proofErr w:type="spellStart"/>
-      <w:r>
-        <w:t>order_items</w:t>
-      </w:r>
-      <w:proofErr w:type="spellEnd"/>
-      <w:r>
-        <w:t xml:space="preserve"> and </w:t>
-      </w:r>
-      <w:proofErr w:type="spellStart"/>
-      <w:r>
-        <w:t>order_item_options</w:t>
-      </w:r>
-      <w:proofErr w:type="spellEnd"/>
-      <w:r>
-        <w:t xml:space="preserve"> in full via </w:t>
-      </w:r>
-      <w:proofErr w:type="spellStart"/>
-      <w:r>
-        <w:t>dbtable</w:t>
-      </w:r>
-      <w:proofErr w:type="spellEnd"/>
-      <w:r>
-        <w:t xml:space="preserve">, filters/joins in Spark against the checkpoint, and writes only new rows to S3 raw/ (skipped entirely if zero new rows, to avoid empty output files). </w:t>
-      </w:r>
-      <w:proofErr w:type="spellStart"/>
-      <w:r>
-        <w:t>date_dim</w:t>
-      </w:r>
-      <w:proofErr w:type="spellEnd"/>
-      <w:r>
-        <w:t xml:space="preserve"> is pulled and written in full on every run, unconditionally, since it carries no incremental logic. All three writes use .coalesce(1) to produce a single output file per table per run rather than Spark's default output partitioning, which initially fragmented </w:t>
-      </w:r>
-      <w:proofErr w:type="spellStart"/>
-      <w:r>
-        <w:t>date_dim</w:t>
-      </w:r>
-      <w:proofErr w:type="spellEnd"/>
-      <w:r>
-        <w:t xml:space="preserve"> into 20 files (~2.5KB each) and </w:t>
-      </w:r>
-      <w:proofErr w:type="spellStart"/>
-      <w:r>
-        <w:t>order_item_options</w:t>
-      </w:r>
-      <w:proofErr w:type="spellEnd"/>
-      <w:r>
-        <w:t xml:space="preserve"> into 4, confirmed via direct row-count verification to be Spark's default partitioning behavior, not duplicate data from repeated run attempts.</w:t>
-      </w:r>
-    </w:p>
-    <w:p>
-      <w:pPr>
-        <w:spacing w:after="160"/>
-      </w:pPr>
-      <w:r>
-        <w:rPr>
-          <w:b/>
-          <w:bCs/>
-        </w:rPr>
-        <w:t>Verified: incremental filter behavior</w:t>
-      </w:r>
-    </w:p>
-    <w:p>
-      <w:pPr>
-        <w:spacing w:after="160"/>
-      </w:pPr>
-      <w:r>
-        <w:t xml:space="preserve">After the initial full historical load (checkpoint defaulted to 1900-01-01, correctly pulling all rows), a subsequent run against an unchanged source correctly returned zero new rows for both </w:t>
-      </w:r>
-      <w:proofErr w:type="spellStart"/>
-      <w:r>
-        <w:t>order_items</w:t>
-      </w:r>
-      <w:proofErr w:type="spellEnd"/>
-      <w:r>
-        <w:t xml:space="preserve"> and </w:t>
-      </w:r>
-      <w:proofErr w:type="spellStart"/>
-      <w:r>
-        <w:t>order_item_options</w:t>
-      </w:r>
-      <w:proofErr w:type="spellEnd"/>
-      <w:r>
-        <w:t xml:space="preserve"> and skipped the S3 write entirely, confirmed via job log output (“</w:t>
-      </w:r>
-      <w:proofErr w:type="spellStart"/>
-      <w:r>
-        <w:t>order_items</w:t>
-      </w:r>
-      <w:proofErr w:type="spellEnd"/>
-      <w:r>
-        <w:t xml:space="preserve">: 0 new rows since checkpoint”). This is direct evidence the checkpoint-based incremental filter functions as designed, not just a description of intended behavior. </w:t>
-      </w:r>
-      <w:proofErr w:type="spellStart"/>
-      <w:r>
-        <w:t>date_dim</w:t>
-      </w:r>
-      <w:proofErr w:type="spellEnd"/>
-      <w:r>
-        <w:t xml:space="preserve"> continued writing its full 365 rows on this same run, as expected given its unconditional design.</w:t>
-      </w:r>
-    </w:p>
-    <w:p>
-      <w:pPr>
-        <w:spacing w:after="160"/>
-      </w:pPr>
-      <w:r>
-        <w:rPr>
-          <w:b/>
-          <w:bCs/>
-        </w:rPr>
-        <w:t>Known operational gotcha: deleting raw/ output without resetting the checkpoint creates a data gap</w:t>
-      </w:r>
-    </w:p>
-    <w:p>
-      <w:pPr>
-        <w:spacing w:after="160"/>
-      </w:pPr>
-      <w:r>
-        <w:t>During small-files remediation, the original fragmented raw/ files were deleted before rerunning the corrected script. Because the prior successful run had already advanced the checkpoint, the corrected run found zero new rows and correctly wrote nothing — leaving the full historical dataset absent from S3 entirely (present only in RDS). The incremental job has no mechanism to detect that previously-extracted output was removed downstream, since the checkpoint tracks source watermark position only, not destination file state. Recovery requires manually resetting the checkpoint parameter to force a full historical re-pull. Documented here as a known limitation of watermark-based incremental design generally, not specific to an implementation bug.</w:t>
-      </w:r>
-    </w:p>
-    <w:p>
-      <w:pPr>
-        <w:spacing w:after="160"/>
-      </w:pPr>
-      <w:r>
-        <w:rPr>
-          <w:b/>
-          <w:bCs/>
-        </w:rPr>
-        <w:t xml:space="preserve">Transform and Aggregate (Glue ETL, </w:t>
-      </w:r>
-      <w:proofErr w:type="spellStart"/>
-      <w:r>
-        <w:rPr>
-          <w:b/>
-          <w:bCs/>
-        </w:rPr>
-        <w:t>PySpark</w:t>
-      </w:r>
-      <w:proofErr w:type="spellEnd"/>
-      <w:r>
-        <w:rPr>
-          <w:b/>
-          <w:bCs/>
-        </w:rPr>
-        <w:t>) — not yet built</w:t>
-      </w:r>
-    </w:p>
-    <w:p>
-      <w:pPr>
-        <w:spacing w:after="160"/>
-      </w:pPr>
-      <w:r>
-        <w:t xml:space="preserve">Transform: standardize column names/types, parse mixed-format date fields explicitly per format (see Section 9), join </w:t>
-      </w:r>
-      <w:proofErr w:type="spellStart"/>
-      <w:r>
-        <w:t>order_items</w:t>
-      </w:r>
-      <w:proofErr w:type="spellEnd"/>
-      <w:r>
-        <w:t xml:space="preserve"> to </w:t>
-      </w:r>
-      <w:proofErr w:type="spellStart"/>
-      <w:r>
-        <w:t>order_item_options</w:t>
-      </w:r>
-      <w:proofErr w:type="spellEnd"/>
-      <w:r>
-        <w:t xml:space="preserve"> on the composite ORDER_ID + LINEITEM_ID key, write to processed/. Aggregate: compute the seven target metric tables (CLV at daily grain, RFM segments, churn risk indicators, sales trend/seasonality, loyalty impact, location performance, discount/pricing effectiveness) into marts/.</w:t>
-      </w:r>
-    </w:p>
-    <w:p>
-      <w:pPr>
-        <w:spacing w:after="160"/>
-      </w:pPr>
-      <w:r>
-        <w:rPr>
-          <w:b/>
-          <w:bCs/>
-        </w:rPr>
-        <w:t xml:space="preserve">Aggregate job (Glue ETL, </w:t>
-      </w:r>
-      <w:proofErr w:type="spellStart"/>
-      <w:r>
-        <w:rPr>
-          <w:b/>
-          <w:bCs/>
-        </w:rPr>
-        <w:t>PySpark</w:t>
-      </w:r>
-      <w:proofErr w:type="spellEnd"/>
-      <w:r>
-        <w:rPr>
-          <w:b/>
-          <w:bCs/>
-        </w:rPr>
-        <w:t>) — in progress, one metric validated</w:t>
-      </w:r>
-    </w:p>
-    <w:p>
-      <w:pPr>
-        <w:spacing w:after="160"/>
-      </w:pPr>
-      <w:r>
-        <w:t xml:space="preserve">Aggregation logic runs entirely in </w:t>
-      </w:r>
-      <w:proofErr w:type="spellStart"/>
-      <w:r>
-        <w:t>PySpark</w:t>
-      </w:r>
-      <w:proofErr w:type="spellEnd"/>
-      <w:r>
-        <w:t xml:space="preserve"> within a single Glue ETL job, not via Athena CTAS — a deliberate divergence from the Healthcare Metrics project's aggregation approach, driven by this project's explicit "all logics should be done using PYSPARK" requirement. Athena's role here is limited to read-only querying of the finished marts/ tables for </w:t>
-      </w:r>
-      <w:proofErr w:type="spellStart"/>
-      <w:r>
-        <w:t>QuickSight</w:t>
-      </w:r>
-      <w:proofErr w:type="spellEnd"/>
-      <w:r>
-        <w:t>.</w:t>
-      </w:r>
-    </w:p>
-    <w:p>
-      <w:pPr>
-        <w:spacing w:after="160"/>
-      </w:pPr>
-      <w:r>
-        <w:t xml:space="preserve">This is the first point in the pipeline where </w:t>
-      </w:r>
-      <w:proofErr w:type="spellStart"/>
-      <w:r>
-        <w:t>order_items</w:t>
-      </w:r>
-      <w:proofErr w:type="spellEnd"/>
-      <w:r>
-        <w:t xml:space="preserve"> and </w:t>
-      </w:r>
-      <w:proofErr w:type="spellStart"/>
-      <w:r>
-        <w:t>order_item_options</w:t>
-      </w:r>
-      <w:proofErr w:type="spellEnd"/>
-      <w:r>
-        <w:t xml:space="preserve"> are actually joined — deliberately deferred from the transform job to avoid fanning out </w:t>
-      </w:r>
-      <w:proofErr w:type="spellStart"/>
-      <w:r>
-        <w:t>order_items</w:t>
-      </w:r>
-      <w:proofErr w:type="spellEnd"/>
-      <w:r>
-        <w:t>' grain before it's needed. Per-line-item total revenue (base item price × quantity, plus the summed price × quantity of all attached options) is computed once and shared across metrics that need it.</w:t>
-      </w:r>
-    </w:p>
-    <w:p>
-      <w:pPr>
-        <w:spacing w:after="160"/>
-      </w:pPr>
-      <w:r>
-        <w:rPr>
-          <w:b/>
-          <w:bCs/>
-        </w:rPr>
-        <w:t>CLV (daily grain) — built and verified.</w:t>
-      </w:r>
-      <w:r>
-        <w:t xml:space="preserve"> Grain: one row per </w:t>
-      </w:r>
-      <w:proofErr w:type="spellStart"/>
-      <w:r>
-        <w:t>user_id</w:t>
-      </w:r>
-      <w:proofErr w:type="spellEnd"/>
-      <w:r>
-        <w:t xml:space="preserve"> per date the customer actually placed an order (not a full calendar spine of every day for every customer — on non-order days, cumulative CLV is unchanged by construction, so a forward-filled row adds no information a dashboard can't infer from a step chart; documented as a deliberate scale-driven </w:t>
-      </w:r>
-      <w:r>
-        <w:lastRenderedPageBreak/>
-        <w:t>simplification). Cumulative CLV computed via a Spark window function (</w:t>
-      </w:r>
-      <w:proofErr w:type="spellStart"/>
-      <w:r>
-        <w:t>partitionBy</w:t>
-      </w:r>
-      <w:proofErr w:type="spellEnd"/>
-      <w:r>
-        <w:t>(</w:t>
-      </w:r>
-      <w:proofErr w:type="spellStart"/>
-      <w:r>
-        <w:t>user_id</w:t>
-      </w:r>
-      <w:proofErr w:type="spellEnd"/>
-      <w:r>
-        <w:t>).</w:t>
-      </w:r>
-      <w:proofErr w:type="spellStart"/>
-      <w:r>
-        <w:t>orderBy</w:t>
-      </w:r>
-      <w:proofErr w:type="spellEnd"/>
-      <w:r>
-        <w:t>(</w:t>
-      </w:r>
-      <w:proofErr w:type="spellStart"/>
-      <w:r>
-        <w:t>order_date</w:t>
-      </w:r>
-      <w:proofErr w:type="spellEnd"/>
-      <w:r>
-        <w:t xml:space="preserve">), running sum). Line items with a null </w:t>
-      </w:r>
-      <w:proofErr w:type="spellStart"/>
-      <w:r>
-        <w:t>user_id</w:t>
-      </w:r>
-      <w:proofErr w:type="spellEnd"/>
-      <w:r>
-        <w:t xml:space="preserve"> are excluded from CLV entirely (no customer to attribute the spend to) — confirmed via job logs: 17,808 of 203,519 total line items (8.75%) excluded, leaving 100,084 customer-day rows written. </w:t>
-      </w:r>
-      <w:r>
-        <w:rPr>
-          <w:b/>
-          <w:bCs/>
-        </w:rPr>
-        <w:t>Verified correct</w:t>
-      </w:r>
-      <w:r>
-        <w:t>, not just "ran without error": downloaded output and confirmed cumulative CLV is monotonically non-decreasing for every customer (0 violations found), the direct proof the window function's running-total logic behaves as designed.</w:t>
-      </w:r>
-    </w:p>
-    <w:p>
-      <w:pPr>
-        <w:spacing w:after="160"/>
-      </w:pPr>
-    </w:p>
-    <w:p>
-      <w:pPr>
-        <w:pStyle w:val="Heading1"/>
-        <w:spacing w:before="280" w:after="140"/>
-      </w:pPr>
-      <w:r>
-        <w:t>9. Known Data Quality Issues</w:t>
+      <w:r>
+        <w:t>PRINTED_CARD_NUMBER loaded as varchar, not a numeric type, despite looking numeric in preview rows — per the requirements doc's own “String” type designation and the field being described as tokenized/masked.</w:t>
       </w:r>
     </w:p>
     <w:p>
@@ -1550,35 +2480,19 @@
       </w:pPr>
       <w:proofErr w:type="spellStart"/>
       <w:r>
-        <w:t>order_item_options</w:t>
-      </w:r>
-      <w:proofErr w:type="spellEnd"/>
-      <w:r>
-        <w:t xml:space="preserve"> → </w:t>
-      </w:r>
-      <w:proofErr w:type="spellStart"/>
-      <w:r>
-        <w:t>order_items</w:t>
-      </w:r>
-      <w:proofErr w:type="spellEnd"/>
-      <w:r>
-        <w:t xml:space="preserve"> join: 28 of 193,017 </w:t>
-      </w:r>
-      <w:proofErr w:type="spellStart"/>
-      <w:r>
-        <w:t>order_item_options</w:t>
-      </w:r>
-      <w:proofErr w:type="spellEnd"/>
-      <w:r>
-        <w:t xml:space="preserve"> rows (0.0145%) reference an ORDER_ID with no corresponding row in </w:t>
-      </w:r>
-      <w:proofErr w:type="spellStart"/>
-      <w:r>
-        <w:t>order_items</w:t>
-      </w:r>
-      <w:proofErr w:type="spellEnd"/>
-      <w:r>
-        <w:t xml:space="preserve"> at all (confirmed via LEFT JOIN diagnostic — true orphans, not a null-LINEITEM_ID edge case). Excluded from the extract via the inner join; documented as a genuine source-data gap, not a join-logic defect.</w:t>
+        <w:t>is_weekend</w:t>
+      </w:r>
+      <w:proofErr w:type="spellEnd"/>
+      <w:r>
+        <w:t xml:space="preserve"> / </w:t>
+      </w:r>
+      <w:proofErr w:type="spellStart"/>
+      <w:r>
+        <w:t>is_holiday</w:t>
+      </w:r>
+      <w:proofErr w:type="spellEnd"/>
+      <w:r>
+        <w:t xml:space="preserve"> loaded as bit — confirmed clean (no blank/non-standard values) via preview before commit.</w:t>
       </w:r>
     </w:p>
     <w:p>
@@ -1590,102 +2504,16 @@
         </w:numPr>
         <w:spacing w:after="100"/>
       </w:pPr>
-      <w:proofErr w:type="spellStart"/>
-      <w:r>
-        <w:t>date_key</w:t>
-      </w:r>
-      <w:proofErr w:type="spellEnd"/>
-      <w:r>
-        <w:t xml:space="preserve"> (</w:t>
-      </w:r>
-      <w:proofErr w:type="spellStart"/>
-      <w:r>
-        <w:t>date_dim</w:t>
-      </w:r>
-      <w:proofErr w:type="spellEnd"/>
-      <w:r>
-        <w:t xml:space="preserve">) is stored as a DD-MM-YYYY string (e.g., ‘16-10-2023’), not ISO format. This does not sort or compare correctly as plain text and must be explicitly parsed to a real date type in the transform stage (e.g., </w:t>
-      </w:r>
-      <w:proofErr w:type="spellStart"/>
-      <w:r>
-        <w:t>to_date</w:t>
-      </w:r>
-      <w:proofErr w:type="spellEnd"/>
-      <w:r>
-        <w:t>(col, ‘dd-MM-</w:t>
-      </w:r>
-      <w:proofErr w:type="spellStart"/>
-      <w:r>
-        <w:t>yyyy</w:t>
-      </w:r>
-      <w:proofErr w:type="spellEnd"/>
-      <w:r>
-        <w:t>’)) rather than relying on string comparison or an assumed ISO ordering downstream.</w:t>
-      </w:r>
-    </w:p>
-    <w:p>
-      <w:pPr>
-        <w:pStyle w:val="ListParagraph"/>
-        <w:numPr>
-          <w:ilvl w:val="0"/>
-          <w:numId w:val="1"/>
-        </w:numPr>
-        <w:spacing w:after="100"/>
-      </w:pPr>
-      <w:proofErr w:type="spellStart"/>
-      <w:r>
-        <w:t>order_items.CREATION_TIME_UTC</w:t>
-      </w:r>
-      <w:proofErr w:type="spellEnd"/>
-      <w:r>
-        <w:t xml:space="preserve"> and related date fields contain mixed date formats across rows (e.g., both M/D/Y and D/M/Y patterns observed during early data review). Requires explicit per-format parsing in the transform stage rather than a single automatic type inference, to avoid silent </w:t>
-      </w:r>
-      <w:proofErr w:type="spellStart"/>
-      <w:r>
-        <w:t>misparsing</w:t>
-      </w:r>
-      <w:proofErr w:type="spellEnd"/>
-      <w:r>
-        <w:t xml:space="preserve"> (a row matching one format's assumption can parse successfully but incorrectly if the true source convention differed row-to-row).</w:t>
-      </w:r>
-    </w:p>
-    <w:p>
-      <w:pPr>
-        <w:pStyle w:val="ListParagraph"/>
-        <w:numPr>
-          <w:ilvl w:val="0"/>
-          <w:numId w:val="1"/>
-        </w:numPr>
-        <w:spacing w:after="100"/>
-      </w:pPr>
-      <w:r>
-        <w:t>PRINTED_CARD_NUMBER loaded as varchar, not a numeric type, despite looking numeric in preview rows — per the requirements doc's own “String” type designation and the field being described as tokenized/masked, meaning some values may contain non-numeric masking characters not visible in a small preview sample.</w:t>
-      </w:r>
-    </w:p>
-    <w:p>
-      <w:pPr>
-        <w:pStyle w:val="ListParagraph"/>
-        <w:numPr>
-          <w:ilvl w:val="0"/>
-          <w:numId w:val="1"/>
-        </w:numPr>
-        <w:spacing w:after="100"/>
-      </w:pPr>
-      <w:proofErr w:type="spellStart"/>
-      <w:r>
-        <w:t>is_weekend</w:t>
-      </w:r>
-      <w:proofErr w:type="spellEnd"/>
-      <w:r>
-        <w:t xml:space="preserve"> / </w:t>
-      </w:r>
-      <w:proofErr w:type="spellStart"/>
-      <w:r>
-        <w:t>is_holiday</w:t>
-      </w:r>
-      <w:proofErr w:type="spellEnd"/>
-      <w:r>
-        <w:t xml:space="preserve"> loaded as bit — confirmed clean (no blank/non-standard values) via preview before commit.</w:t>
+      <w:r>
+        <w:t xml:space="preserve">19 of 20,174 customers (0.094%) show order volume far beyond plausible individual behavior, independently confirmed against source RDS data — flagged via </w:t>
+      </w:r>
+      <w:proofErr w:type="spellStart"/>
+      <w:r>
+        <w:t>is_likely_non_individual</w:t>
+      </w:r>
+      <w:proofErr w:type="spellEnd"/>
+      <w:r>
+        <w:t xml:space="preserve"> across CLV/RFM/churn risk rather than excluded (see Section 8.1).</w:t>
       </w:r>
     </w:p>
     <w:p>
@@ -1712,7 +2540,7 @@
           <w:left w:w="10" w:type="dxa"/>
           <w:right w:w="10" w:type="dxa"/>
         </w:tblCellMar>
-        <w:tblLook w:val="0000" w:firstRow="0" w:lastRow="0" w:firstColumn="0" w:lastColumn="0" w:noHBand="0" w:noVBand="0"/>
+        <w:tblLook w:val="04A0" w:firstRow="1" w:lastRow="0" w:firstColumn="1" w:lastColumn="0" w:noHBand="0" w:noVBand="1"/>
       </w:tblPr>
       <w:tblGrid>
         <w:gridCol w:w="3200"/>
@@ -1816,7 +2644,11 @@
           </w:tcPr>
           <w:p>
             <w:r>
-              <w:t>Upgraded from db.t3.micro (free-tier) after repeated RESOURCE_SEMAPHORE memory-grant failures during index builds and full-table JDBC reads; free-tier micro proved insufficient for this workload's actual memory pressure, not just a temporary fix.</w:t>
+              <w:t xml:space="preserve">Upgraded from db.t3.micro (free-tier) after repeated RESOURCE_SEMAPHORE </w:t>
+            </w:r>
+            <w:r>
+              <w:lastRenderedPageBreak/>
+              <w:t>memory-grant failures during index builds and full-table JDBC reads.</w:t>
             </w:r>
           </w:p>
         </w:tc>
@@ -1834,6 +2666,7 @@
           </w:tcPr>
           <w:p>
             <w:r>
+              <w:lastRenderedPageBreak/>
               <w:t>RDS storage (gp2, 20 GiB)</w:t>
             </w:r>
           </w:p>
@@ -1882,7 +2715,7 @@
           </w:tcPr>
           <w:p>
             <w:r>
-              <w:t>~$22/</w:t>
+              <w:t>~$29/</w:t>
             </w:r>
             <w:proofErr w:type="spellStart"/>
             <w:r>
@@ -1890,7 +2723,7 @@
             </w:r>
             <w:proofErr w:type="spellEnd"/>
             <w:r>
-              <w:t xml:space="preserve"> (4 × ~$7.30 combined once amortized — 3 continuous, 1 added later)</w:t>
+              <w:t xml:space="preserve"> (4 × ~$7.30)</w:t>
             </w:r>
           </w:p>
         </w:tc>
@@ -1964,7 +2797,7 @@
             </w:r>
             <w:proofErr w:type="spellEnd"/>
             <w:r>
-              <w:t>)</w:t>
+              <w:t>) × 3 jobs</w:t>
             </w:r>
           </w:p>
         </w:tc>
@@ -2113,7 +2946,7 @@
           </w:tcPr>
           <w:p>
             <w:r>
-              <w:t>Well within this project's usage.</w:t>
+              <w:t>Well within this project's usage. Note: repo is public, which has its own separate free CI minutes allowance.</w:t>
             </w:r>
           </w:p>
         </w:tc>
@@ -2143,13 +2976,13 @@
           <w:left w:w="10" w:type="dxa"/>
           <w:right w:w="10" w:type="dxa"/>
         </w:tblCellMar>
-        <w:tblLook w:val="0000" w:firstRow="0" w:lastRow="0" w:firstColumn="0" w:lastColumn="0" w:noHBand="0" w:noVBand="0"/>
+        <w:tblLook w:val="04A0" w:firstRow="1" w:lastRow="0" w:firstColumn="1" w:lastColumn="0" w:noHBand="0" w:noVBand="1"/>
       </w:tblPr>
       <w:tblGrid>
         <w:gridCol w:w="2031"/>
-        <w:gridCol w:w="2445"/>
-        <w:gridCol w:w="2845"/>
-        <w:gridCol w:w="2679"/>
+        <w:gridCol w:w="2442"/>
+        <w:gridCol w:w="2849"/>
+        <w:gridCol w:w="2678"/>
       </w:tblGrid>
       <w:tr>
         <w:tblPrEx>
@@ -2172,7 +3005,6 @@
                 <w:b/>
                 <w:bCs/>
               </w:rPr>
-              <w:lastRenderedPageBreak/>
               <w:t>Layer</w:t>
             </w:r>
           </w:p>
@@ -2345,15 +3177,7 @@
             </w:r>
             <w:proofErr w:type="spellEnd"/>
             <w:r>
-              <w:t>) costs more than the endpoint approach (~$22/</w:t>
-            </w:r>
-            <w:proofErr w:type="spellStart"/>
-            <w:r>
-              <w:t>mo</w:t>
-            </w:r>
-            <w:proofErr w:type="spellEnd"/>
-            <w:r>
-              <w:t>) at this scale; endpoint approach fully resolved connectivity once the complete service list was identified.</w:t>
+              <w:t>) costs more than the endpoint approach at this scale; endpoint approach fully resolved connectivity once the complete service list was identified.</w:t>
             </w:r>
           </w:p>
         </w:tc>
@@ -2417,15 +3241,7 @@
             </w:r>
             <w:proofErr w:type="spellEnd"/>
             <w:r>
-              <w:t xml:space="preserve"> triggers a documented AWS Glue bug (‘key not found: location/</w:t>
-            </w:r>
-            <w:proofErr w:type="spellStart"/>
-            <w:r>
-              <w:t>url</w:t>
-            </w:r>
-            <w:proofErr w:type="spellEnd"/>
-            <w:r>
-              <w:t>’); full pull is computationally free at this data volume and avoids the bug entirely.</w:t>
+              <w:t xml:space="preserve"> triggers a documented AWS Glue bug; full pull is computationally free at this data volume.</w:t>
             </w:r>
           </w:p>
         </w:tc>
@@ -2539,7 +3355,7 @@
           </w:tcPr>
           <w:p>
             <w:r>
-              <w:t xml:space="preserve">Matches the requirement's literal wording (GitHub as trigger and execution environment); free compute vs. </w:t>
+              <w:t xml:space="preserve">Matches the requirement's literal wording; free compute vs. </w:t>
             </w:r>
             <w:proofErr w:type="spellStart"/>
             <w:r>
@@ -2555,7 +3371,132 @@
             </w:r>
             <w:proofErr w:type="spellEnd"/>
             <w:r>
-              <w:t xml:space="preserve"> small but real per-pipeline and per-build-minute cost.</w:t>
+              <w:t xml:space="preserve"> small but real cost.</w:t>
+            </w:r>
+          </w:p>
+        </w:tc>
+      </w:tr>
+      <w:tr>
+        <w:tblPrEx>
+          <w:tblCellMar>
+            <w:top w:w="0" w:type="dxa"/>
+            <w:bottom w:w="0" w:type="dxa"/>
+          </w:tblCellMar>
+        </w:tblPrEx>
+        <w:tc>
+          <w:tcPr>
+            <w:tcW w:w="1900" w:type="dxa"/>
+          </w:tcPr>
+          <w:p>
+            <w:r>
+              <w:t>Transform-to-aggregate join timing</w:t>
+            </w:r>
+          </w:p>
+        </w:tc>
+        <w:tc>
+          <w:tcPr>
+            <w:tcW w:w="2500" w:type="dxa"/>
+          </w:tcPr>
+          <w:p>
+            <w:r>
+              <w:t>Deferred to aggregate layer</w:t>
+            </w:r>
+          </w:p>
+        </w:tc>
+        <w:tc>
+          <w:tcPr>
+            <w:tcW w:w="2900" w:type="dxa"/>
+          </w:tcPr>
+          <w:p>
+            <w:r>
+              <w:t xml:space="preserve">Join </w:t>
+            </w:r>
+            <w:proofErr w:type="spellStart"/>
+            <w:r>
+              <w:t>order_items</w:t>
+            </w:r>
+            <w:proofErr w:type="spellEnd"/>
+            <w:r>
+              <w:t xml:space="preserve"> to </w:t>
+            </w:r>
+            <w:proofErr w:type="spellStart"/>
+            <w:r>
+              <w:t>order_item_options</w:t>
+            </w:r>
+            <w:proofErr w:type="spellEnd"/>
+            <w:r>
+              <w:t xml:space="preserve"> in the transform job</w:t>
+            </w:r>
+          </w:p>
+        </w:tc>
+        <w:tc>
+          <w:tcPr>
+            <w:tcW w:w="2700" w:type="dxa"/>
+          </w:tcPr>
+          <w:p>
+            <w:proofErr w:type="spellStart"/>
+            <w:r>
+              <w:t>order_item_options</w:t>
+            </w:r>
+            <w:proofErr w:type="spellEnd"/>
+            <w:r>
+              <w:t xml:space="preserve"> is a child table; joining early would silently fan out </w:t>
+            </w:r>
+            <w:proofErr w:type="spellStart"/>
+            <w:r>
+              <w:t>order_items</w:t>
+            </w:r>
+            <w:proofErr w:type="spellEnd"/>
+            <w:r>
+              <w:t>' grain. Same pattern as Healthcare Metrics' Athena-CTAS-deferred join.</w:t>
+            </w:r>
+          </w:p>
+        </w:tc>
+      </w:tr>
+      <w:tr>
+        <w:tblPrEx>
+          <w:tblCellMar>
+            <w:top w:w="0" w:type="dxa"/>
+            <w:bottom w:w="0" w:type="dxa"/>
+          </w:tblCellMar>
+        </w:tblPrEx>
+        <w:tc>
+          <w:tcPr>
+            <w:tcW w:w="1900" w:type="dxa"/>
+          </w:tcPr>
+          <w:p>
+            <w:r>
+              <w:t>Discount effectiveness</w:t>
+            </w:r>
+          </w:p>
+        </w:tc>
+        <w:tc>
+          <w:tcPr>
+            <w:tcW w:w="2500" w:type="dxa"/>
+          </w:tcPr>
+          <w:p>
+            <w:r>
+              <w:t>Price-tier analysis (substitute metric)</w:t>
+            </w:r>
+          </w:p>
+        </w:tc>
+        <w:tc>
+          <w:tcPr>
+            <w:tcW w:w="2900" w:type="dxa"/>
+          </w:tcPr>
+          <w:p>
+            <w:r>
+              <w:t>Literal discount/promo effectiveness as specified</w:t>
+            </w:r>
+          </w:p>
+        </w:tc>
+        <w:tc>
+          <w:tcPr>
+            <w:tcW w:w="2700" w:type="dxa"/>
+          </w:tcPr>
+          <w:p>
+            <w:r>
+              <w:t>Source data has no discount field and no negative-price pattern; confirmed via direct inspection, not assumed. Flagged as an open item for the SME.</w:t>
             </w:r>
           </w:p>
         </w:tc>
@@ -2567,6 +3508,7 @@
         <w:spacing w:before="280" w:after="140"/>
       </w:pPr>
       <w:r>
+        <w:lastRenderedPageBreak/>
         <w:t>12. Security Considerations</w:t>
       </w:r>
     </w:p>
@@ -2580,7 +3522,7 @@
         <w:spacing w:after="100"/>
       </w:pPr>
       <w:r>
-        <w:t>RDS: SQL Server Express edition (free-tier eligible, no embedded licensing cost), storage encryption enabled at creation (cannot be added after the fact without a snapshot-copy-restore cycle), inbound security group access scoped to the developer's IP rather than the tutorial's default 0.0.0.0/0.</w:t>
+        <w:t>RDS: SQL Server Express edition (free-tier eligible, no embedded licensing cost), storage encryption enabled at creation (cannot be added after the fact without a snapshot-copy-restore cycle), inbound security group access scoped to the developer's IP rather than the tutorial's default 0.0.0.0/0, plus a self-referencing ALL TCP rule required for Spark driver/executor coordination (see Section 6) — still restricted to self-reference only, never opened to 0.0.0.0/0.</w:t>
       </w:r>
     </w:p>
     <w:p>
@@ -2619,7 +3561,7 @@
         <w:spacing w:after="100"/>
       </w:pPr>
       <w:r>
-        <w:t>IAM: least-privilege, per-project, per-pipeline-stage roles (see Section 7); GitHub Actions authenticates via OIDC federation rather than long-lived stored AWS access keys.</w:t>
+        <w:t>IAM: least-privilege, per-project, per-pipeline-stage roles (see Section 7); GitHub Actions authenticates via OIDC federation rather than long-lived stored AWS access keys, with the trust policy scoped to GitHub's new immutable subject-claim format (see Section 13).</w:t>
       </w:r>
     </w:p>
     <w:p>
@@ -2631,16 +3573,13 @@
         </w:numPr>
         <w:spacing w:after="100"/>
       </w:pPr>
-      <w:r>
-        <w:t xml:space="preserve">Security group: inbound rules scoped to specific ports/self-reference where possible; the ALL TCP self-referencing rule (Section 6) is broader than ideal but is a documented, unavoidable Spark requirement, not an </w:t>
-      </w:r>
-      <w:proofErr w:type="spellStart"/>
-      <w:r>
-        <w:t>unscoped</w:t>
-      </w:r>
-      <w:proofErr w:type="spellEnd"/>
-      <w:r>
-        <w:t xml:space="preserve"> convenience rule — still restricted to self-reference only, never opened to 0.0.0.0/0.</w:t>
+      <w:proofErr w:type="spellStart"/>
+      <w:r>
+        <w:t>iam:PassRole</w:t>
+      </w:r>
+      <w:proofErr w:type="spellEnd"/>
+      <w:r>
+        <w:t xml:space="preserve"> on the CI/CD role is scoped to exactly the three Glue execution role ARNs it needs to pass, not a wildcard (see Section 7).</w:t>
       </w:r>
     </w:p>
     <w:p>
@@ -2657,11 +3596,95 @@
         <w:spacing w:after="160"/>
       </w:pPr>
       <w:r>
-        <w:t>Implemented via GitHub Actions, federated to AWS through an OIDC identity provider (token.actions.githubusercontent.com) registered once at the account level. The workflow's IAM role trust policy is scoped to this specific repository and branch (</w:t>
-      </w:r>
-      <w:proofErr w:type="spellStart"/>
-      <w:r>
-        <w:t>repo:ronknighton</w:t>
+        <w:t>Implemented via GitHub Actions, federated to AWS through an OIDC identity provider (token.actions.githubusercontent.com) registered once at the account level. CI (</w:t>
+      </w:r>
+      <w:proofErr w:type="spellStart"/>
+      <w:r>
+        <w:t>ci.yml</w:t>
+      </w:r>
+      <w:proofErr w:type="spellEnd"/>
+      <w:r>
+        <w:t xml:space="preserve">): runs on every push/PR — flake8 lint, black format-check, and </w:t>
+      </w:r>
+      <w:proofErr w:type="spellStart"/>
+      <w:r>
+        <w:t>pytest</w:t>
+      </w:r>
+      <w:proofErr w:type="spellEnd"/>
+      <w:r>
+        <w:t xml:space="preserve"> unit tests. CD (</w:t>
+      </w:r>
+      <w:proofErr w:type="spellStart"/>
+      <w:r>
+        <w:t>deploy.yml</w:t>
+      </w:r>
+      <w:proofErr w:type="spellEnd"/>
+      <w:r>
+        <w:t>): runs only on merge to main — deploys the three validated Glue scripts to S3 and updates each Glue job definition. Fully implemented and operational as of this revision.</w:t>
+      </w:r>
+    </w:p>
+    <w:p>
+      <w:pPr>
+        <w:spacing w:after="160"/>
+      </w:pPr>
+      <w:r>
+        <w:t>Testing scope, stated honestly: the actual Glue job scripts cannot be directly unit-tested in a standard GitHub Actions runner, since their Glue-specific boilerplate (</w:t>
+      </w:r>
+      <w:proofErr w:type="spellStart"/>
+      <w:r>
+        <w:t>SparkContext</w:t>
+      </w:r>
+      <w:proofErr w:type="spellEnd"/>
+      <w:r>
+        <w:t xml:space="preserve">, </w:t>
+      </w:r>
+      <w:proofErr w:type="spellStart"/>
+      <w:r>
+        <w:t>GlueContext</w:t>
+      </w:r>
+      <w:proofErr w:type="spellEnd"/>
+      <w:r>
+        <w:t xml:space="preserve">, </w:t>
+      </w:r>
+      <w:proofErr w:type="spellStart"/>
+      <w:r>
+        <w:t>job.init</w:t>
+      </w:r>
+      <w:proofErr w:type="spellEnd"/>
+      <w:r>
+        <w:t xml:space="preserve">) requires the real AWS Glue runtime to construct, which a generic runner with a plain pip-installed </w:t>
+      </w:r>
+      <w:proofErr w:type="spellStart"/>
+      <w:r>
+        <w:t>pyspark</w:t>
+      </w:r>
+      <w:proofErr w:type="spellEnd"/>
+      <w:r>
+        <w:t xml:space="preserve"> does not provide. The included test (test_price_tier_logic.py) demonstrates the testable pattern via a standalone reimplementation of one piece of pure transformation logic, not a test of the actual deployed file. Correctness of the real scripts is covered by the extensive manual validation process documented throughout Section 8, not by automated unit tests — a deliberate, documented tradeoff rather than a silently incomplete test suite. A more mature version of this pipeline would refactor the real scripts to separate pure transformation functions (importable, testable) from the thin Glue-specific entry point.</w:t>
+      </w:r>
+    </w:p>
+    <w:p>
+      <w:pPr>
+        <w:spacing w:after="160"/>
+      </w:pPr>
+      <w:r>
+        <w:rPr>
+          <w:b/>
+          <w:bCs/>
+        </w:rPr>
+        <w:t>Deployment troubleshooting encountered</w:t>
+      </w:r>
+    </w:p>
+    <w:p>
+      <w:pPr>
+        <w:spacing w:after="160"/>
+      </w:pPr>
+      <w:r>
+        <w:t>1. GitHub's immutable OIDC subject claim format (rolled out July 15, 2026): repositories created after this date automatically receive tokens with numeric owner/repo IDs embedded in the sub claim (</w:t>
+      </w:r>
+      <w:proofErr w:type="spellStart"/>
+      <w:r>
+        <w:t>repo:owner@ownerID</w:t>
       </w:r>
       <w:proofErr w:type="spellEnd"/>
       <w:r>
@@ -2669,51 +3692,75 @@
       </w:r>
       <w:proofErr w:type="spellStart"/>
       <w:r>
-        <w:t>dea-global-partners:ref:refs</w:t>
-      </w:r>
-      <w:proofErr w:type="spellEnd"/>
-      <w:r>
-        <w:t>/heads/main). CI: lint (flake8/black) and unit tests (</w:t>
-      </w:r>
-      <w:proofErr w:type="spellStart"/>
-      <w:r>
-        <w:t>pytest</w:t>
-      </w:r>
-      <w:proofErr w:type="spellEnd"/>
-      <w:r>
-        <w:t xml:space="preserve">, with a local </w:t>
-      </w:r>
-      <w:proofErr w:type="spellStart"/>
-      <w:r>
-        <w:t>SparkSession</w:t>
-      </w:r>
-      <w:proofErr w:type="spellEnd"/>
-      <w:r>
-        <w:t xml:space="preserve"> for </w:t>
-      </w:r>
-      <w:proofErr w:type="spellStart"/>
-      <w:r>
-        <w:t>PySpark</w:t>
-      </w:r>
-      <w:proofErr w:type="spellEnd"/>
-      <w:r>
-        <w:t xml:space="preserve">-specific assertions — </w:t>
-      </w:r>
-      <w:proofErr w:type="spellStart"/>
-      <w:r>
-        <w:t>chispa</w:t>
-      </w:r>
-      <w:proofErr w:type="spellEnd"/>
-      <w:r>
-        <w:t xml:space="preserve"> recommended for </w:t>
-      </w:r>
-      <w:proofErr w:type="spellStart"/>
-      <w:r>
-        <w:t>DataFrame</w:t>
-      </w:r>
-      <w:proofErr w:type="spellEnd"/>
-      <w:r>
-        <w:t xml:space="preserve"> equality/schema checks). CD: on merge to main, deploy the validated Glue script to s3://dea-global-partners-rhk/scripts/ and update the corresponding Glue job definition. Not yet implemented at time of writing; scripts are currently deployed and iterated on manually while the extract job's logic is being validated, per the deliberate decision to prove a script works manually before automating its deployment.</w:t>
+        <w:t>repo@repoID:ref</w:t>
+      </w:r>
+      <w:proofErr w:type="spellEnd"/>
+      <w:r>
+        <w:t xml:space="preserve">:...) rather than the classic name-only format, specifically to prevent a repo-rename/recycling security issue. The trust policy's sub condition initially used the classic format and was rejected with a generic “Not authorized to perform </w:t>
+      </w:r>
+      <w:proofErr w:type="spellStart"/>
+      <w:r>
+        <w:t>sts:AssumeRoleWithWebIdentity</w:t>
+      </w:r>
+      <w:proofErr w:type="spellEnd"/>
+      <w:r>
+        <w:t xml:space="preserve">” error that did not indicate which specific condition failed. Root cause isolated via CloudTrail's </w:t>
+      </w:r>
+      <w:proofErr w:type="spellStart"/>
+      <w:r>
+        <w:t>AssumeRoleWithWebIdentity</w:t>
+      </w:r>
+      <w:proofErr w:type="spellEnd"/>
+      <w:r>
+        <w:t xml:space="preserve"> event, which showed the token's actual sub claim verbatim — the only way to see the real value being compared, since AWS's rejection message does not surface it. Fixed by updating the trust policy's sub condition to match the immutable-ID format actually issued for this repository.</w:t>
+      </w:r>
+    </w:p>
+    <w:p>
+      <w:pPr>
+        <w:spacing w:after="160"/>
+      </w:pPr>
+      <w:r>
+        <w:t xml:space="preserve">2. </w:t>
+      </w:r>
+      <w:proofErr w:type="spellStart"/>
+      <w:r>
+        <w:t>aws</w:t>
+      </w:r>
+      <w:proofErr w:type="spellEnd"/>
+      <w:r>
+        <w:t xml:space="preserve"> glue update-job requires Role to be explicitly included in the --job-update payload, even when only the script location is changing — it does not reliably preserve the job's existing IAM role if omitted, producing “Role should not be null or empty.” Fixed by explicitly including each job's correct execution role ARN in every deploy step.</w:t>
+      </w:r>
+    </w:p>
+    <w:p>
+      <w:pPr>
+        <w:spacing w:after="160"/>
+      </w:pPr>
+      <w:r>
+        <w:t xml:space="preserve">3. The CI/CD role's Glue update permission alone was insufficient: AWS requires </w:t>
+      </w:r>
+      <w:proofErr w:type="spellStart"/>
+      <w:r>
+        <w:t>iam:PassRole</w:t>
+      </w:r>
+      <w:proofErr w:type="spellEnd"/>
+      <w:r>
+        <w:t xml:space="preserve"> on any role being associated with a resource on the caller's behalf, which </w:t>
+      </w:r>
+      <w:proofErr w:type="spellStart"/>
+      <w:r>
+        <w:t>UpdateJob</w:t>
+      </w:r>
+      <w:proofErr w:type="spellEnd"/>
+      <w:r>
+        <w:t xml:space="preserve"> does implicitly whenever a Role is specified. Fixed by scoping </w:t>
+      </w:r>
+      <w:proofErr w:type="spellStart"/>
+      <w:r>
+        <w:t>iam:PassRole</w:t>
+      </w:r>
+      <w:proofErr w:type="spellEnd"/>
+      <w:r>
+        <w:t xml:space="preserve"> on the CI/CD role to exactly the three Glue execution role ARNs it needs to pass (see Section 7).</w:t>
       </w:r>
     </w:p>
     <w:p>
@@ -2722,7 +3769,6 @@
         <w:spacing w:before="280" w:after="140"/>
       </w:pPr>
       <w:r>
-        <w:lastRenderedPageBreak/>
         <w:t>14. Open Items &amp; Next Steps</w:t>
       </w:r>
     </w:p>
@@ -2736,7 +3782,7 @@
         <w:spacing w:after="100"/>
       </w:pPr>
       <w:r>
-        <w:t>Build and validate the transform job (raw/ → processed/): mixed-date-format parsing, composite-key join, column standardization.</w:t>
+        <w:t>Configure Glue Workflow to orchestrate extract → transform → aggregate with retry/failure-reload handling and its native scheduled trigger.</w:t>
       </w:r>
     </w:p>
     <w:p>
@@ -2749,7 +3795,7 @@
         <w:spacing w:after="100"/>
       </w:pPr>
       <w:r>
-        <w:t>Build and validate the aggregate job (processed/ → marts/): seven target metric tables, including the CLV daily-grain design discussed with the SME.</w:t>
+        <w:t>Set up Glue Crawler(s) to register schema across all three S3 layers for Athena.</w:t>
       </w:r>
     </w:p>
     <w:p>
@@ -2762,7 +3808,24 @@
         <w:spacing w:after="100"/>
       </w:pPr>
       <w:r>
-        <w:t>Configure Glue Workflow to orchestrate extract → transform → aggregate with retry/failure-reload handling and its native scheduled trigger.</w:t>
+        <w:lastRenderedPageBreak/>
+        <w:t xml:space="preserve">Build the seven </w:t>
+      </w:r>
+      <w:proofErr w:type="spellStart"/>
+      <w:r>
+        <w:t>QuickSight</w:t>
+      </w:r>
+      <w:proofErr w:type="spellEnd"/>
+      <w:r>
+        <w:t xml:space="preserve"> dashboard visuals against the marts/ layer via Athena; grant </w:t>
+      </w:r>
+      <w:proofErr w:type="spellStart"/>
+      <w:r>
+        <w:t>QuickSight's</w:t>
+      </w:r>
+      <w:proofErr w:type="spellEnd"/>
+      <w:r>
+        <w:t xml:space="preserve"> service-linked role access to the bucket and Athena workgroup.</w:t>
       </w:r>
     </w:p>
     <w:p>
@@ -2775,7 +3838,23 @@
         <w:spacing w:after="100"/>
       </w:pPr>
       <w:r>
-        <w:t>Set up Glue Crawler(s) to register schema across all three S3 layers for Athena.</w:t>
+        <w:t xml:space="preserve">Raise open SME questions accumulated during development: (1) whether the 19 </w:t>
+      </w:r>
+      <w:proofErr w:type="spellStart"/>
+      <w:r>
+        <w:t>is_likely_non_individual</w:t>
+      </w:r>
+      <w:proofErr w:type="spellEnd"/>
+      <w:r>
+        <w:t xml:space="preserve"> accounts represent known corporate/catering accounts or a data quality issue to exclude; (2) whether the ~53% revenue concentration in a single restaurant location reflects the real business or a dataset artifact; (3) the </w:t>
+      </w:r>
+      <w:proofErr w:type="spellStart"/>
+      <w:r>
+        <w:t>discount_effectiveness</w:t>
+      </w:r>
+      <w:proofErr w:type="spellEnd"/>
+      <w:r>
+        <w:t xml:space="preserve"> scope substitution (price-tier analysis in place of literal discount effectiveness, given no discount field exists in the source data); (4) the ~5x order-value difference between loyalty-flagged and non-loyalty orders.</w:t>
       </w:r>
     </w:p>
     <w:p>
@@ -2788,23 +3867,15 @@
         <w:spacing w:after="100"/>
       </w:pPr>
       <w:r>
-        <w:t xml:space="preserve">Build the seven </w:t>
-      </w:r>
-      <w:proofErr w:type="spellStart"/>
-      <w:r>
-        <w:t>QuickSight</w:t>
-      </w:r>
-      <w:proofErr w:type="spellEnd"/>
-      <w:r>
-        <w:t xml:space="preserve"> dashboard visuals against the marts/ layer via Athena; grant </w:t>
-      </w:r>
-      <w:proofErr w:type="spellStart"/>
-      <w:r>
-        <w:t>QuickSight's</w:t>
-      </w:r>
-      <w:proofErr w:type="spellEnd"/>
-      <w:r>
-        <w:t xml:space="preserve"> service-linked role access to the bucket and Athena workgroup.</w:t>
+        <w:t xml:space="preserve">Clean up the Spark-history-log warning in job runs, caused by Glue defaulting to an auto-provisioned </w:t>
+      </w:r>
+      <w:proofErr w:type="spellStart"/>
+      <w:r>
+        <w:t>aws</w:t>
+      </w:r>
+      <w:proofErr w:type="spellEnd"/>
+      <w:r>
+        <w:t>-glue-assets-&lt;account&gt;-&lt;region&gt; bucket that was never created in this account by design; point job monitoring/logging options at the project's own bucket instead.</w:t>
       </w:r>
     </w:p>
     <w:p>
@@ -2817,7 +3888,7 @@
         <w:spacing w:after="100"/>
       </w:pPr>
       <w:r>
-        <w:t>Implement the GitHub Actions CI/CD workflow (Section 13) once the manual deployment pattern is fully proven across all three Glue jobs.</w:t>
+        <w:t>Revisit RDS instance sizing: currently on db.t3.small after db.t3.micro proved insufficient under load; confirm whether this needs to remain elevated for ongoing operation or can be scaled back down between work sessions.</w:t>
       </w:r>
     </w:p>
     <w:p>
@@ -2830,15 +3901,7 @@
         <w:spacing w:after="100"/>
       </w:pPr>
       <w:r>
-        <w:t xml:space="preserve">Clean up the Spark-history-log warning in job runs, caused by Glue defaulting to an auto-provisioned </w:t>
-      </w:r>
-      <w:proofErr w:type="spellStart"/>
-      <w:r>
-        <w:t>aws</w:t>
-      </w:r>
-      <w:proofErr w:type="spellEnd"/>
-      <w:r>
-        <w:t>-glue-assets-&lt;account&gt;-&lt;region&gt; bucket that was never created in this account (by design — see the Healthcare Metrics precedent of avoiding Glue's auto-provisioned resources); point job monitoring/logging options at the project's own bucket instead.</w:t>
+        <w:t>Consider refactoring the three Glue scripts to separate pure transformation functions from Glue-specific boilerplate, enabling genuine unit test coverage of the actual deployed logic rather than the current standalone-reimplementation test pattern (see Section 13).</w:t>
       </w:r>
     </w:p>
     <w:p>
@@ -2851,20 +3914,7 @@
         <w:spacing w:after="100"/>
       </w:pPr>
       <w:r>
-        <w:t>Apply the scripts/* IAM read-permission fix (Section 7) proactively to the transform and aggregate roles before first use, rather than waiting to hit the identical bootstrap error twice more.</w:t>
-      </w:r>
-    </w:p>
-    <w:p>
-      <w:pPr>
-        <w:pStyle w:val="ListParagraph"/>
-        <w:numPr>
-          <w:ilvl w:val="0"/>
-          <w:numId w:val="1"/>
-        </w:numPr>
-        <w:spacing w:after="100"/>
-      </w:pPr>
-      <w:r>
-        <w:t>Revisit RDS instance sizing: currently on db.t3.small after db.t3.micro proved insufficient under load; confirm whether this needs to remain elevated for the transform/aggregate jobs' query patterns or can be scaled back down between work sessions.</w:t>
+        <w:t>Failure notification via SNS + Lambda — designed, scoped, deliberately not implemented for this capstone; see Section 4 for reasoning. Would be required for a production deployment.</w:t>
       </w:r>
     </w:p>
     <w:sectPr>
@@ -2880,10 +3930,10 @@
 <file path=word/numbering.xml><?xml version="1.0" encoding="utf-8"?>
 <w:numbering xmlns:wpc="http://schemas.microsoft.com/office/word/2010/wordprocessingCanvas" xmlns:cx="http://schemas.microsoft.com/office/drawing/2014/chartex" xmlns:cx1="http://schemas.microsoft.com/office/drawing/2015/9/8/chartex" xmlns:cx2="http://schemas.microsoft.com/office/drawing/2015/10/21/chartex" xmlns:cx3="http://schemas.microsoft.com/office/drawing/2016/5/9/chartex" xmlns:cx4="http://schemas.microsoft.com/office/drawing/2016/5/10/chartex" xmlns:cx5="http://schemas.microsoft.com/office/drawing/2016/5/11/chartex" xmlns:cx6="http://schemas.microsoft.com/office/drawing/2016/5/12/chartex" xmlns:cx7="http://schemas.microsoft.com/office/drawing/2016/5/13/chartex" xmlns:cx8="http://schemas.microsoft.com/office/drawing/2016/5/14/chartex" xmlns:mc="http://schemas.openxmlformats.org/markup-compatibility/2006" xmlns:aink="http://schemas.microsoft.com/office/drawing/2016/ink" xmlns:am3d="http://schemas.microsoft.com/office/drawing/2017/model3d" xmlns:o="urn:schemas-microsoft-com:office:office" xmlns:oel="http://schemas.microsoft.com/office/2019/extlst" xmlns:r="http://schemas.openxmlformats.org/officeDocument/2006/relationships" xmlns:m="http://schemas.openxmlformats.org/officeDocument/2006/math" xmlns:v="urn:schemas-microsoft-com:vml" xmlns:wp14="http://schemas.microsoft.com/office/word/2010/wordprocessingDrawing" xmlns:wp="http://schemas.openxmlformats.org/drawingml/2006/wordprocessingDrawing" xmlns:w10="urn:schemas-microsoft-com:office:word" xmlns:w="http://schemas.openxmlformats.org/wordprocessingml/2006/main" xmlns:w14="http://schemas.microsoft.com/office/word/2010/wordml" xmlns:w15="http://schemas.microsoft.com/office/word/2012/wordml" xmlns:w16cei="http://schemas.microsoft.com/office/word/2026/wordml/cei" xmlns:w16cex="http://schemas.microsoft.com/office/word/2018/wordml/cex" xmlns:w16cid="http://schemas.microsoft.com/office/word/2016/wordml/cid" xmlns:w16="http://schemas.microsoft.com/office/word/2018/wordml" xmlns:w16du="http://schemas.microsoft.com/office/word/2023/wordml/word16du" xmlns:w16sdtdh="http://schemas.microsoft.com/office/word/2020/wordml/sdtdatahash" xmlns:w16sdtfl="http://schemas.microsoft.com/office/word/2024/wordml/sdtformatlock" xmlns:w16se="http://schemas.microsoft.com/office/word/2015/wordml/symex" xmlns:wpg="http://schemas.microsoft.com/office/word/2010/wordprocessingGroup" xmlns:wpi="http://schemas.microsoft.com/office/word/2010/wordprocessingInk" xmlns:wne="http://schemas.microsoft.com/office/word/2006/wordml" xmlns:wps="http://schemas.microsoft.com/office/word/2010/wordprocessingShape" mc:Ignorable="w14 w15 w16se w16cid w16 w16cex w16sdtdh w16sdtfl w16du wp14">
   <w:abstractNum w:abstractNumId="0" w15:restartNumberingAfterBreak="0">
-    <w:nsid w:val="601D76D5"/>
+    <w:nsid w:val="58A73BD0"/>
     <w:multiLevelType w:val="hybridMultilevel"/>
-    <w:tmpl w:val="348E7782"/>
-    <w:lvl w:ilvl="0" w:tplc="1E502EEA">
+    <w:tmpl w:val="67BCF0E6"/>
+    <w:lvl w:ilvl="0" w:tplc="2690C29C">
       <w:start w:val="1"/>
       <w:numFmt w:val="bullet"/>
       <w:lvlText w:val="●"/>
@@ -2892,7 +3942,7 @@
         <w:ind w:left="720" w:hanging="360"/>
       </w:pPr>
     </w:lvl>
-    <w:lvl w:ilvl="1" w:tplc="16783902">
+    <w:lvl w:ilvl="1" w:tplc="4E36FA68">
       <w:start w:val="1"/>
       <w:numFmt w:val="bullet"/>
       <w:lvlText w:val="○"/>
@@ -2901,7 +3951,7 @@
         <w:ind w:left="1440" w:hanging="360"/>
       </w:pPr>
     </w:lvl>
-    <w:lvl w:ilvl="2" w:tplc="6D5600CE">
+    <w:lvl w:ilvl="2" w:tplc="EF3C97CA">
       <w:start w:val="1"/>
       <w:numFmt w:val="bullet"/>
       <w:lvlText w:val="■"/>
@@ -2910,7 +3960,7 @@
         <w:ind w:left="2160" w:hanging="360"/>
       </w:pPr>
     </w:lvl>
-    <w:lvl w:ilvl="3" w:tplc="1EFADD06">
+    <w:lvl w:ilvl="3" w:tplc="9E885848">
       <w:start w:val="1"/>
       <w:numFmt w:val="bullet"/>
       <w:lvlText w:val="●"/>
@@ -2919,7 +3969,7 @@
         <w:ind w:left="2880" w:hanging="360"/>
       </w:pPr>
     </w:lvl>
-    <w:lvl w:ilvl="4" w:tplc="D1F8CC6A">
+    <w:lvl w:ilvl="4" w:tplc="1A2C4A78">
       <w:start w:val="1"/>
       <w:numFmt w:val="bullet"/>
       <w:lvlText w:val="○"/>
@@ -2928,7 +3978,7 @@
         <w:ind w:left="3600" w:hanging="360"/>
       </w:pPr>
     </w:lvl>
-    <w:lvl w:ilvl="5" w:tplc="89D2A084">
+    <w:lvl w:ilvl="5" w:tplc="40767BE2">
       <w:start w:val="1"/>
       <w:numFmt w:val="bullet"/>
       <w:lvlText w:val="■"/>
@@ -2937,7 +3987,7 @@
         <w:ind w:left="4320" w:hanging="360"/>
       </w:pPr>
     </w:lvl>
-    <w:lvl w:ilvl="6" w:tplc="5ACCABE0">
+    <w:lvl w:ilvl="6" w:tplc="1F9AD6CC">
       <w:start w:val="1"/>
       <w:numFmt w:val="bullet"/>
       <w:lvlText w:val="●"/>
@@ -2946,7 +3996,7 @@
         <w:ind w:left="5040" w:hanging="360"/>
       </w:pPr>
     </w:lvl>
-    <w:lvl w:ilvl="7" w:tplc="46E8A516">
+    <w:lvl w:ilvl="7" w:tplc="C7F6DA34">
       <w:start w:val="1"/>
       <w:numFmt w:val="bullet"/>
       <w:lvlText w:val="●"/>
@@ -2955,7 +4005,7 @@
         <w:ind w:left="5760" w:hanging="360"/>
       </w:pPr>
     </w:lvl>
-    <w:lvl w:ilvl="8" w:tplc="DF6A8A44">
+    <w:lvl w:ilvl="8" w:tplc="746E3BDC">
       <w:start w:val="1"/>
       <w:numFmt w:val="bullet"/>
       <w:lvlText w:val="●"/>
@@ -2965,7 +4015,7 @@
       </w:pPr>
     </w:lvl>
   </w:abstractNum>
-  <w:num w:numId="1" w16cid:durableId="1723482118">
+  <w:num w:numId="1" w16cid:durableId="1696227671">
     <w:abstractNumId w:val="0"/>
     <w:lvlOverride w:ilvl="0">
       <w:startOverride w:val="1"/>

</xml_diff>